<commit_message>
docs: Add Chapter 1 (Introduction & Institutional Background) to Markdown and Word (.docx) report
</commit_message>
<xml_diff>
--- a/Central_Bank_of_India_ILAS_Internship_Report.docx
+++ b/Central_Bank_of_India_ILAS_Internship_Report.docx
@@ -12350,6 +12350,1593 @@
         </w:tc>
       </w:tr>
     </w:tbl>
+    <w:p>
+      <w:r>
+        <w:br w:type="page"/>
+      </w:r>
+    </w:p>
+    <w:p>
+      <w:pPr>
+        <w:spacing w:before="1600"/>
+        <w:jc w:val="center"/>
+      </w:pPr>
+      <w:r>
+        <w:rPr>
+          <w:rFonts w:ascii="Arial" w:hAnsi="Arial"/>
+          <w:b/>
+          <w:color w:val="C69214"/>
+          <w:sz w:val="36"/>
+        </w:rPr>
+        <w:t>CHAPTER 1</w:t>
+        <w:br/>
+      </w:r>
+      <w:r>
+        <w:rPr>
+          <w:rFonts w:ascii="Arial" w:hAnsi="Arial"/>
+          <w:b/>
+          <w:color w:val="003366"/>
+          <w:sz w:val="44"/>
+        </w:rPr>
+        <w:t>INTRODUCTION &amp; INSTITUTIONAL BACKGROUND</w:t>
+        <w:br/>
+        <w:br/>
+      </w:r>
+    </w:p>
+    <w:tbl>
+      <w:tblPr>
+        <w:tblW w:type="auto" w:w="0"/>
+        <w:jc w:val="center"/>
+        <w:tblLook w:firstColumn="1" w:firstRow="1" w:lastColumn="0" w:lastRow="0" w:noHBand="0" w:noVBand="1" w:val="04A0"/>
+      </w:tblPr>
+      <w:tblGrid>
+        <w:gridCol w:w="9360"/>
+      </w:tblGrid>
+      <w:tr>
+        <w:tc>
+          <w:tcPr>
+            <w:tcW w:type="dxa" w:w="8640"/>
+            <w:shd w:fill="F1F5F9"/>
+            <w:tcMar>
+              <w:top w:w="100" w:type="dxa"/>
+              <w:bottom w:w="100" w:type="dxa"/>
+              <w:left w:w="140" w:type="dxa"/>
+              <w:right w:w="140" w:type="dxa"/>
+            </w:tcMar>
+          </w:tcPr>
+          <w:p>
+            <w:r>
+              <w:rPr>
+                <w:rFonts w:ascii="Calibri" w:hAnsi="Calibri"/>
+                <w:b/>
+                <w:color w:val="003366"/>
+                <w:sz w:val="22"/>
+              </w:rPr>
+              <w:t>📑 CHAPTER ROADMAP &amp; KEY SECTIONS:</w:t>
+              <w:br/>
+              <w:br/>
+            </w:r>
+            <w:r>
+              <w:rPr>
+                <w:rFonts w:ascii="Calibri" w:hAnsi="Calibri"/>
+                <w:color w:val="1E293B"/>
+                <w:sz w:val="20"/>
+              </w:rPr>
+              <w:t>• 1.1 The Indian Commercial Banking Ecosystem &amp; Underwriting Challenges</w:t>
+              <w:br/>
+            </w:r>
+            <w:r>
+              <w:rPr>
+                <w:rFonts w:ascii="Calibri" w:hAnsi="Calibri"/>
+                <w:color w:val="1E293B"/>
+                <w:sz w:val="20"/>
+              </w:rPr>
+              <w:t>• 1.2 Central Bank of India: Institutional Heritage &amp; Digital Strategy</w:t>
+              <w:br/>
+            </w:r>
+            <w:r>
+              <w:rPr>
+                <w:rFonts w:ascii="Calibri" w:hAnsi="Calibri"/>
+                <w:color w:val="1E293B"/>
+                <w:sz w:val="20"/>
+              </w:rPr>
+              <w:t>• 1.3 Problem Statement &amp; Turnaround Time (TAT) Friction</w:t>
+              <w:br/>
+            </w:r>
+            <w:r>
+              <w:rPr>
+                <w:rFonts w:ascii="Calibri" w:hAnsi="Calibri"/>
+                <w:color w:val="1E293B"/>
+                <w:sz w:val="20"/>
+              </w:rPr>
+              <w:t>• 1.4 Objectives and Scope of the Intelligent Loan Appraisal System (ILAS)</w:t>
+              <w:br/>
+            </w:r>
+            <w:r>
+              <w:rPr>
+                <w:rFonts w:ascii="Calibri" w:hAnsi="Calibri"/>
+                <w:color w:val="1E293B"/>
+                <w:sz w:val="20"/>
+              </w:rPr>
+              <w:t>• 1.5 Novelty and Institutional Value Proposition</w:t>
+              <w:br/>
+            </w:r>
+            <w:r>
+              <w:rPr>
+                <w:rFonts w:ascii="Calibri" w:hAnsi="Calibri"/>
+                <w:color w:val="1E293B"/>
+                <w:sz w:val="20"/>
+              </w:rPr>
+              <w:t>• 1.6 Report Organization &amp; Chapter Roadmap</w:t>
+              <w:br/>
+            </w:r>
+          </w:p>
+        </w:tc>
+      </w:tr>
+    </w:tbl>
+    <w:p>
+      <w:r>
+        <w:br w:type="page"/>
+      </w:r>
+    </w:p>
+    <w:p>
+      <w:pPr>
+        <w:spacing w:after="320"/>
+      </w:pPr>
+      <w:r>
+        <w:rPr>
+          <w:rFonts w:ascii="Arial" w:hAnsi="Arial"/>
+          <w:b/>
+          <w:color w:val="003366"/>
+          <w:sz w:val="32"/>
+        </w:rPr>
+        <w:t>CHAPTER 1: INTRODUCTION &amp; INSTITUTIONAL BACKGROUND</w:t>
+      </w:r>
+    </w:p>
+    <w:p>
+      <w:pPr>
+        <w:spacing w:after="320"/>
+      </w:pPr>
+      <w:r>
+        <w:rPr>
+          <w:rFonts w:ascii="Calibri" w:hAnsi="Calibri"/>
+          <w:b/>
+          <w:color w:val="003366"/>
+          <w:sz w:val="26"/>
+        </w:rPr>
+        <w:t>1.1 The Indian Commercial Banking Ecosystem &amp; Underwriting Challenges</w:t>
+        <w:br/>
+      </w:r>
+      <w:r>
+        <w:rPr>
+          <w:rFonts w:ascii="Calibri" w:hAnsi="Calibri"/>
+          <w:color w:val="1E293B"/>
+          <w:sz w:val="22"/>
+        </w:rPr>
+        <w:t>The commercial banking system in India represents the foundational circulatory system of the national economy, mobilizing domestic savings and channeling capital into productive economic sectors. Public Sector Banks (PSBs) and Scheduled Commercial Banks (SCBs) manage an aggregate domestic credit portfolio exceeding ₹170 Lakh Crores (as of FY 2025–2026), supporting diverse economic agents ranging from individual retail consumers to capital-intensive Micro, Small, and Medium Enterprises (MSMEs).</w:t>
+        <w:br/>
+        <w:br/>
+        <w:t>Credit appraisal—the systematic evaluation of a borrower's creditworthiness, financial solvency, debt-servicing capacity, collateral sufficiency, and default probability—constitutes the core operational capability that dictates a commercial bank's asset quality, Net Interest Margin (NIM), and Capital to Risk-Weighted Assets Ratio (CRAR).</w:t>
+        <w:br/>
+        <w:br/>
+        <w:t>Despite extensive modernization in front-end payments (such as Unified Payments Interface - UPI) and core banking infrastructure (CBS), the core credit underwriting workflow across commercial banks in India remains encumbered by severe operational friction:</w:t>
+        <w:br/>
+        <w:br/>
+        <w:t>1. Information Asymmetry &amp; Data Heterogeneity: Credit underwriting requires assimilating multi-format documentation, including audited annual financial statements, provisional balance sheets, Chartered Accountant (CA) certified Credit Monitoring Arrangement (CMA) data, income tax returns (ITR-V), GST returns (GSTR-3B / GSTR-1), six-month operational bank account statements, and property valuation certificates. Ingesting and reconciling these unstructured and semi-structured documents manually consumes substantial analytical bandwidth.</w:t>
+        <w:br/>
+        <w:br/>
+        <w:t>2. Manual Financial Spreading &amp; Ratio Computation: Underwriting officers must manually transcribe balance sheet line items into internal banking spreadsheets to calculate statutory financial liquidity ratios (Current Ratio, Quick Ratio), leverage metrics (Debt-to-Equity Ratio, Total Outside Liabilities to Tangible Net Worth), and debt-serviceability indices (Debt Service Coverage Ratio - DSCR, Fixed Obligation to Income Ratio - FOIR). This manual computation introduces material latency and creates susceptibility to transcription errors.</w:t>
+        <w:br/>
+        <w:br/>
+        <w:t>3. Complex Regulatory Cross-Referencing: Credit appraisals must strictly comply with a vast corpus of regulatory circulars issued by the Reserve Bank of India (RBI)—such as prudential ceilings on Loan-to-Value (LTV) ratios and risk-weighted capital provisioning—as well as internal Master Circulars on Rate of Interest (RBLR grids), lending thresholds, and Micro and Small Enterprise (MSE) rating scorecards. Manually cross-referencing multi-hundred-page policy documents leads to operational fatigue and inadvertent compliance slippages.</w:t>
+        <w:br/>
+        <w:br/>
+        <w:t>4. Subjective Risk Adjudication: Traditional credit appraisal relies heavily on heuristic judgment and qualitative discretion. The absence of automated, forward-looking predictive default models often leads to inconsistent risk rating assignments across different branch locations and underwriting officers.</w:t>
+      </w:r>
+    </w:p>
+    <w:p>
+      <w:pPr>
+        <w:spacing w:after="320"/>
+      </w:pPr>
+      <w:r>
+        <w:rPr>
+          <w:rFonts w:ascii="Calibri" w:hAnsi="Calibri"/>
+          <w:b/>
+          <w:color w:val="003366"/>
+          <w:sz w:val="26"/>
+        </w:rPr>
+        <w:t>1.2 Central Bank of India: Institutional Heritage &amp; Digital Strategy</w:t>
+        <w:br/>
+      </w:r>
+      <w:r>
+        <w:rPr>
+          <w:rFonts w:ascii="Calibri" w:hAnsi="Calibri"/>
+          <w:color w:val="1E293B"/>
+          <w:sz w:val="22"/>
+        </w:rPr>
+        <w:t>Established on 21st December 1911 by the visionary banker Sir Sorabji Pochkhanawala under the chairmanship of the eminent nationalist leader Sir Pherozeshah Mehta, the Central Bank of India (CBoI) holds the distinguished historical honor of being the first truly Indian commercial bank completely owned and managed by Indians without foreign assistance. Promoted with the nationalist ethos of 'Central to You Since 1911', the institution was nationalized by the Government of India in July 1969.</w:t>
+        <w:br/>
+        <w:br/>
+        <w:t>Today, Central Bank of India operates an expansive pan-India footprint comprising over 4,500 branch offices, more than 3,000 automated teller machines (ATMs), and over 100 Regional Offices, with a commanding presence in rural, semi-urban, and industrial growth corridors.</w:t>
+        <w:br/>
+        <w:br/>
+        <w:t>Institutional Role of Regional Office, Visakhapatnam:</w:t>
+        <w:br/>
+        <w:t>The Visakhapatnam Regional Office oversees branch operations and credit disbursement across a strategically vital coastal industrial corridor in Andhra Pradesh. The region represents a dynamic credit mix comprising:</w:t>
+        <w:br/>
+        <w:t>• Retail Credit Demands: Housing loans (Cent Home), vehicle finance (Cent Vehicle), personal loans (Cent Personal), and educational credit driven by urban professionals and industrial workforces.</w:t>
+        <w:br/>
+        <w:t>• Micro and Small Enterprise (MSME) Facilities: Working capital limits (Cash Credit / Overdraft), term loans, and bank guarantees for manufacturing ancillary units, port-related logistics providers, marine processing units, and service enterprises clustered around the Visakhapatnam industrial belt.</w:t>
+        <w:br/>
+        <w:br/>
+        <w:t>Under its ongoing digital transformation strategy, Central Bank of India is actively transitioning from legacy document-intensive underwriting toward automated, rule-governed, and data-driven credit appraisal mechanisms. The objective is to compress operational Turnaround Time (TAT), eliminate manual appraisal subjectivity, enforce automated regulatory compliance, and deploy advanced artificial intelligence to safeguard the bank's balance sheet against non-performing assets (NPAs).</w:t>
+      </w:r>
+    </w:p>
+    <w:p>
+      <w:pPr>
+        <w:spacing w:after="200"/>
+      </w:pPr>
+      <w:r>
+        <w:rPr>
+          <w:rFonts w:ascii="Calibri" w:hAnsi="Calibri"/>
+          <w:b/>
+          <w:color w:val="003366"/>
+          <w:sz w:val="26"/>
+        </w:rPr>
+        <w:t>1.3 Problem Statement &amp; Turnaround Time (TAT) Friction</w:t>
+        <w:br/>
+      </w:r>
+      <w:r>
+        <w:rPr>
+          <w:rFonts w:ascii="Calibri" w:hAnsi="Calibri"/>
+          <w:color w:val="1E293B"/>
+          <w:sz w:val="22"/>
+        </w:rPr>
+        <w:t>The traditional credit underwriting lifecycle in public sector commercial banking is characterized by an extensive multi-stage pipeline. A detailed operational audit of the manual underwriting process reveals severe time inflation across every phase of credit processing:</w:t>
+      </w:r>
+    </w:p>
+    <w:p>
+      <w:r>
+        <w:rPr>
+          <w:rFonts w:ascii="Calibri" w:hAnsi="Calibri"/>
+          <w:b/>
+          <w:color w:val="003366"/>
+          <w:sz w:val="21"/>
+        </w:rPr>
+        <w:t>Table 1.1: Operational Turnaround Time (TAT) Breakdown Across Manual Credit Stages</w:t>
+      </w:r>
+    </w:p>
+    <w:tbl>
+      <w:tblPr>
+        <w:tblW w:type="auto" w:w="0"/>
+        <w:jc w:val="center"/>
+        <w:tblLook w:firstColumn="1" w:firstRow="1" w:lastColumn="0" w:lastRow="0" w:noHBand="0" w:noVBand="1" w:val="04A0"/>
+      </w:tblPr>
+      <w:tblGrid>
+        <w:gridCol w:w="1872"/>
+        <w:gridCol w:w="1872"/>
+        <w:gridCol w:w="1872"/>
+        <w:gridCol w:w="1872"/>
+        <w:gridCol w:w="1872"/>
+      </w:tblGrid>
+      <w:tr>
+        <w:tc>
+          <w:tcPr>
+            <w:tcW w:type="dxa" w:w="1008"/>
+            <w:shd w:fill="003366"/>
+            <w:tcMar>
+              <w:top w:w="60" w:type="dxa"/>
+              <w:bottom w:w="60" w:type="dxa"/>
+              <w:left w:w="60" w:type="dxa"/>
+              <w:right w:w="60" w:type="dxa"/>
+            </w:tcMar>
+          </w:tcPr>
+          <w:p>
+            <w:r>
+              <w:rPr>
+                <w:rFonts w:ascii="Calibri" w:hAnsi="Calibri"/>
+                <w:b/>
+                <w:color w:val="FFFFFF"/>
+                <w:sz w:val="18"/>
+              </w:rPr>
+              <w:t>STAGE</w:t>
+            </w:r>
+          </w:p>
+        </w:tc>
+        <w:tc>
+          <w:tcPr>
+            <w:tcW w:type="dxa" w:w="2160"/>
+            <w:shd w:fill="003366"/>
+            <w:tcMar>
+              <w:top w:w="60" w:type="dxa"/>
+              <w:bottom w:w="60" w:type="dxa"/>
+              <w:left w:w="60" w:type="dxa"/>
+              <w:right w:w="60" w:type="dxa"/>
+            </w:tcMar>
+          </w:tcPr>
+          <w:p>
+            <w:r>
+              <w:rPr>
+                <w:rFonts w:ascii="Calibri" w:hAnsi="Calibri"/>
+                <w:b/>
+                <w:color w:val="FFFFFF"/>
+                <w:sz w:val="18"/>
+              </w:rPr>
+              <w:t>UNDERWRITING PHASE</w:t>
+            </w:r>
+          </w:p>
+        </w:tc>
+        <w:tc>
+          <w:tcPr>
+            <w:tcW w:type="dxa" w:w="2592"/>
+            <w:shd w:fill="003366"/>
+            <w:tcMar>
+              <w:top w:w="60" w:type="dxa"/>
+              <w:bottom w:w="60" w:type="dxa"/>
+              <w:left w:w="60" w:type="dxa"/>
+              <w:right w:w="60" w:type="dxa"/>
+            </w:tcMar>
+          </w:tcPr>
+          <w:p>
+            <w:r>
+              <w:rPr>
+                <w:rFonts w:ascii="Calibri" w:hAnsi="Calibri"/>
+                <w:b/>
+                <w:color w:val="FFFFFF"/>
+                <w:sz w:val="18"/>
+              </w:rPr>
+              <w:t>CORE ACTIVITIES</w:t>
+            </w:r>
+          </w:p>
+        </w:tc>
+        <w:tc>
+          <w:tcPr>
+            <w:tcW w:type="dxa" w:w="1440"/>
+            <w:shd w:fill="003366"/>
+            <w:tcMar>
+              <w:top w:w="60" w:type="dxa"/>
+              <w:bottom w:w="60" w:type="dxa"/>
+              <w:left w:w="60" w:type="dxa"/>
+              <w:right w:w="60" w:type="dxa"/>
+            </w:tcMar>
+          </w:tcPr>
+          <w:p>
+            <w:r>
+              <w:rPr>
+                <w:rFonts w:ascii="Calibri" w:hAnsi="Calibri"/>
+                <w:b/>
+                <w:color w:val="FFFFFF"/>
+                <w:sz w:val="18"/>
+              </w:rPr>
+              <w:t>MANUAL TAT</w:t>
+            </w:r>
+          </w:p>
+        </w:tc>
+        <w:tc>
+          <w:tcPr>
+            <w:tcW w:type="dxa" w:w="2160"/>
+            <w:shd w:fill="003366"/>
+            <w:tcMar>
+              <w:top w:w="60" w:type="dxa"/>
+              <w:bottom w:w="60" w:type="dxa"/>
+              <w:left w:w="60" w:type="dxa"/>
+              <w:right w:w="60" w:type="dxa"/>
+            </w:tcMar>
+          </w:tcPr>
+          <w:p>
+            <w:r>
+              <w:rPr>
+                <w:rFonts w:ascii="Calibri" w:hAnsi="Calibri"/>
+                <w:b/>
+                <w:color w:val="FFFFFF"/>
+                <w:sz w:val="18"/>
+              </w:rPr>
+              <w:t>BOTTLENECKS</w:t>
+            </w:r>
+          </w:p>
+        </w:tc>
+      </w:tr>
+      <w:tr>
+        <w:tc>
+          <w:tcPr>
+            <w:tcW w:type="dxa" w:w="1008"/>
+            <w:shd w:fill="F8FAFC"/>
+            <w:tcMar>
+              <w:top w:w="40" w:type="dxa"/>
+              <w:bottom w:w="40" w:type="dxa"/>
+              <w:left w:w="50" w:type="dxa"/>
+              <w:right w:w="50" w:type="dxa"/>
+            </w:tcMar>
+          </w:tcPr>
+          <w:p>
+            <w:r>
+              <w:rPr>
+                <w:rFonts w:ascii="Calibri" w:hAnsi="Calibri"/>
+                <w:b/>
+                <w:color w:val="003366"/>
+                <w:sz w:val="17"/>
+              </w:rPr>
+              <w:t>1</w:t>
+            </w:r>
+          </w:p>
+        </w:tc>
+        <w:tc>
+          <w:tcPr>
+            <w:tcW w:type="dxa" w:w="2160"/>
+            <w:shd w:fill="F8FAFC"/>
+            <w:tcMar>
+              <w:top w:w="40" w:type="dxa"/>
+              <w:bottom w:w="40" w:type="dxa"/>
+              <w:left w:w="50" w:type="dxa"/>
+              <w:right w:w="50" w:type="dxa"/>
+            </w:tcMar>
+          </w:tcPr>
+          <w:p>
+            <w:r>
+              <w:rPr>
+                <w:rFonts w:ascii="Calibri" w:hAnsi="Calibri"/>
+                <w:b w:val="0"/>
+                <w:color w:val="1E293B"/>
+                <w:sz w:val="17"/>
+              </w:rPr>
+              <w:t>Customer Data Ingestion</w:t>
+            </w:r>
+          </w:p>
+        </w:tc>
+        <w:tc>
+          <w:tcPr>
+            <w:tcW w:type="dxa" w:w="2592"/>
+            <w:shd w:fill="F8FAFC"/>
+            <w:tcMar>
+              <w:top w:w="40" w:type="dxa"/>
+              <w:bottom w:w="40" w:type="dxa"/>
+              <w:left w:w="50" w:type="dxa"/>
+              <w:right w:w="50" w:type="dxa"/>
+            </w:tcMar>
+          </w:tcPr>
+          <w:p>
+            <w:r>
+              <w:rPr>
+                <w:rFonts w:ascii="Calibri" w:hAnsi="Calibri"/>
+                <w:b w:val="0"/>
+                <w:color w:val="1E293B"/>
+                <w:sz w:val="17"/>
+              </w:rPr>
+              <w:t>Collecting physical application forms, salary slips, and ID proofs.</w:t>
+            </w:r>
+          </w:p>
+        </w:tc>
+        <w:tc>
+          <w:tcPr>
+            <w:tcW w:type="dxa" w:w="1440"/>
+            <w:shd w:fill="F8FAFC"/>
+            <w:tcMar>
+              <w:top w:w="40" w:type="dxa"/>
+              <w:bottom w:w="40" w:type="dxa"/>
+              <w:left w:w="50" w:type="dxa"/>
+              <w:right w:w="50" w:type="dxa"/>
+            </w:tcMar>
+          </w:tcPr>
+          <w:p>
+            <w:r>
+              <w:rPr>
+                <w:rFonts w:ascii="Calibri" w:hAnsi="Calibri"/>
+                <w:b w:val="0"/>
+                <w:color w:val="1E293B"/>
+                <w:sz w:val="17"/>
+              </w:rPr>
+              <w:t>24 – 48 Hours</w:t>
+            </w:r>
+          </w:p>
+        </w:tc>
+        <w:tc>
+          <w:tcPr>
+            <w:tcW w:type="dxa" w:w="2160"/>
+            <w:shd w:fill="F8FAFC"/>
+            <w:tcMar>
+              <w:top w:w="40" w:type="dxa"/>
+              <w:bottom w:w="40" w:type="dxa"/>
+              <w:left w:w="50" w:type="dxa"/>
+              <w:right w:w="50" w:type="dxa"/>
+            </w:tcMar>
+          </w:tcPr>
+          <w:p>
+            <w:r>
+              <w:rPr>
+                <w:rFonts w:ascii="Calibri" w:hAnsi="Calibri"/>
+                <w:b w:val="0"/>
+                <w:color w:val="1E293B"/>
+                <w:sz w:val="17"/>
+              </w:rPr>
+              <w:t>Manual entry into Core Banking (CBS); unencrypted PII exposure.</w:t>
+            </w:r>
+          </w:p>
+        </w:tc>
+      </w:tr>
+      <w:tr>
+        <w:tc>
+          <w:tcPr>
+            <w:tcW w:type="dxa" w:w="1008"/>
+            <w:shd w:fill="FFFFFF"/>
+            <w:tcMar>
+              <w:top w:w="40" w:type="dxa"/>
+              <w:bottom w:w="40" w:type="dxa"/>
+              <w:left w:w="50" w:type="dxa"/>
+              <w:right w:w="50" w:type="dxa"/>
+            </w:tcMar>
+          </w:tcPr>
+          <w:p>
+            <w:r>
+              <w:rPr>
+                <w:rFonts w:ascii="Calibri" w:hAnsi="Calibri"/>
+                <w:b/>
+                <w:color w:val="003366"/>
+                <w:sz w:val="17"/>
+              </w:rPr>
+              <w:t>2</w:t>
+            </w:r>
+          </w:p>
+        </w:tc>
+        <w:tc>
+          <w:tcPr>
+            <w:tcW w:type="dxa" w:w="2160"/>
+            <w:shd w:fill="FFFFFF"/>
+            <w:tcMar>
+              <w:top w:w="40" w:type="dxa"/>
+              <w:bottom w:w="40" w:type="dxa"/>
+              <w:left w:w="50" w:type="dxa"/>
+              <w:right w:w="50" w:type="dxa"/>
+            </w:tcMar>
+          </w:tcPr>
+          <w:p>
+            <w:r>
+              <w:rPr>
+                <w:rFonts w:ascii="Calibri" w:hAnsi="Calibri"/>
+                <w:b w:val="0"/>
+                <w:color w:val="1E293B"/>
+                <w:sz w:val="17"/>
+              </w:rPr>
+              <w:t>Document Processing &amp; OCR</w:t>
+            </w:r>
+          </w:p>
+        </w:tc>
+        <w:tc>
+          <w:tcPr>
+            <w:tcW w:type="dxa" w:w="2592"/>
+            <w:shd w:fill="FFFFFF"/>
+            <w:tcMar>
+              <w:top w:w="40" w:type="dxa"/>
+              <w:bottom w:w="40" w:type="dxa"/>
+              <w:left w:w="50" w:type="dxa"/>
+              <w:right w:w="50" w:type="dxa"/>
+            </w:tcMar>
+          </w:tcPr>
+          <w:p>
+            <w:r>
+              <w:rPr>
+                <w:rFonts w:ascii="Calibri" w:hAnsi="Calibri"/>
+                <w:b w:val="0"/>
+                <w:color w:val="1E293B"/>
+                <w:sz w:val="17"/>
+              </w:rPr>
+              <w:t>Manual extraction of line items from PDF/Word balance sheets.</w:t>
+            </w:r>
+          </w:p>
+        </w:tc>
+        <w:tc>
+          <w:tcPr>
+            <w:tcW w:type="dxa" w:w="1440"/>
+            <w:shd w:fill="FFFFFF"/>
+            <w:tcMar>
+              <w:top w:w="40" w:type="dxa"/>
+              <w:bottom w:w="40" w:type="dxa"/>
+              <w:left w:w="50" w:type="dxa"/>
+              <w:right w:w="50" w:type="dxa"/>
+            </w:tcMar>
+          </w:tcPr>
+          <w:p>
+            <w:r>
+              <w:rPr>
+                <w:rFonts w:ascii="Calibri" w:hAnsi="Calibri"/>
+                <w:b w:val="0"/>
+                <w:color w:val="1E293B"/>
+                <w:sz w:val="17"/>
+              </w:rPr>
+              <w:t>24 – 48 Hours</w:t>
+            </w:r>
+          </w:p>
+        </w:tc>
+        <w:tc>
+          <w:tcPr>
+            <w:tcW w:type="dxa" w:w="2160"/>
+            <w:shd w:fill="FFFFFF"/>
+            <w:tcMar>
+              <w:top w:w="40" w:type="dxa"/>
+              <w:bottom w:w="40" w:type="dxa"/>
+              <w:left w:w="50" w:type="dxa"/>
+              <w:right w:w="50" w:type="dxa"/>
+            </w:tcMar>
+          </w:tcPr>
+          <w:p>
+            <w:r>
+              <w:rPr>
+                <w:rFonts w:ascii="Calibri" w:hAnsi="Calibri"/>
+                <w:b w:val="0"/>
+                <w:color w:val="1E293B"/>
+                <w:sz w:val="17"/>
+              </w:rPr>
+              <w:t>Heterogeneous formats; lack of standardized financial schemas.</w:t>
+            </w:r>
+          </w:p>
+        </w:tc>
+      </w:tr>
+      <w:tr>
+        <w:tc>
+          <w:tcPr>
+            <w:tcW w:type="dxa" w:w="1008"/>
+            <w:shd w:fill="F8FAFC"/>
+            <w:tcMar>
+              <w:top w:w="40" w:type="dxa"/>
+              <w:bottom w:w="40" w:type="dxa"/>
+              <w:left w:w="50" w:type="dxa"/>
+              <w:right w:w="50" w:type="dxa"/>
+            </w:tcMar>
+          </w:tcPr>
+          <w:p>
+            <w:r>
+              <w:rPr>
+                <w:rFonts w:ascii="Calibri" w:hAnsi="Calibri"/>
+                <w:b/>
+                <w:color w:val="003366"/>
+                <w:sz w:val="17"/>
+              </w:rPr>
+              <w:t>3</w:t>
+            </w:r>
+          </w:p>
+        </w:tc>
+        <w:tc>
+          <w:tcPr>
+            <w:tcW w:type="dxa" w:w="2160"/>
+            <w:shd w:fill="F8FAFC"/>
+            <w:tcMar>
+              <w:top w:w="40" w:type="dxa"/>
+              <w:bottom w:w="40" w:type="dxa"/>
+              <w:left w:w="50" w:type="dxa"/>
+              <w:right w:w="50" w:type="dxa"/>
+            </w:tcMar>
+          </w:tcPr>
+          <w:p>
+            <w:r>
+              <w:rPr>
+                <w:rFonts w:ascii="Calibri" w:hAnsi="Calibri"/>
+                <w:b w:val="0"/>
+                <w:color w:val="1E293B"/>
+                <w:sz w:val="17"/>
+              </w:rPr>
+              <w:t>KYC &amp; Identity Verification</w:t>
+            </w:r>
+          </w:p>
+        </w:tc>
+        <w:tc>
+          <w:tcPr>
+            <w:tcW w:type="dxa" w:w="2592"/>
+            <w:shd w:fill="F8FAFC"/>
+            <w:tcMar>
+              <w:top w:w="40" w:type="dxa"/>
+              <w:bottom w:w="40" w:type="dxa"/>
+              <w:left w:w="50" w:type="dxa"/>
+              <w:right w:w="50" w:type="dxa"/>
+            </w:tcMar>
+          </w:tcPr>
+          <w:p>
+            <w:r>
+              <w:rPr>
+                <w:rFonts w:ascii="Calibri" w:hAnsi="Calibri"/>
+                <w:b w:val="0"/>
+                <w:color w:val="1E293B"/>
+                <w:sz w:val="17"/>
+              </w:rPr>
+              <w:t>Cross-checking PAN, Aadhaar, and MCA incorporation documents.</w:t>
+            </w:r>
+          </w:p>
+        </w:tc>
+        <w:tc>
+          <w:tcPr>
+            <w:tcW w:type="dxa" w:w="1440"/>
+            <w:shd w:fill="F8FAFC"/>
+            <w:tcMar>
+              <w:top w:w="40" w:type="dxa"/>
+              <w:bottom w:w="40" w:type="dxa"/>
+              <w:left w:w="50" w:type="dxa"/>
+              <w:right w:w="50" w:type="dxa"/>
+            </w:tcMar>
+          </w:tcPr>
+          <w:p>
+            <w:r>
+              <w:rPr>
+                <w:rFonts w:ascii="Calibri" w:hAnsi="Calibri"/>
+                <w:b w:val="0"/>
+                <w:color w:val="1E293B"/>
+                <w:sz w:val="17"/>
+              </w:rPr>
+              <w:t>12 – 24 Hours</w:t>
+            </w:r>
+          </w:p>
+        </w:tc>
+        <w:tc>
+          <w:tcPr>
+            <w:tcW w:type="dxa" w:w="2160"/>
+            <w:shd w:fill="F8FAFC"/>
+            <w:tcMar>
+              <w:top w:w="40" w:type="dxa"/>
+              <w:bottom w:w="40" w:type="dxa"/>
+              <w:left w:w="50" w:type="dxa"/>
+              <w:right w:w="50" w:type="dxa"/>
+            </w:tcMar>
+          </w:tcPr>
+          <w:p>
+            <w:r>
+              <w:rPr>
+                <w:rFonts w:ascii="Calibri" w:hAnsi="Calibri"/>
+                <w:b w:val="0"/>
+                <w:color w:val="1E293B"/>
+                <w:sz w:val="17"/>
+              </w:rPr>
+              <w:t>Disjointed external verification portals; risk of synthetic identity fraud.</w:t>
+            </w:r>
+          </w:p>
+        </w:tc>
+      </w:tr>
+      <w:tr>
+        <w:tc>
+          <w:tcPr>
+            <w:tcW w:type="dxa" w:w="1008"/>
+            <w:shd w:fill="FFFFFF"/>
+            <w:tcMar>
+              <w:top w:w="40" w:type="dxa"/>
+              <w:bottom w:w="40" w:type="dxa"/>
+              <w:left w:w="50" w:type="dxa"/>
+              <w:right w:w="50" w:type="dxa"/>
+            </w:tcMar>
+          </w:tcPr>
+          <w:p>
+            <w:r>
+              <w:rPr>
+                <w:rFonts w:ascii="Calibri" w:hAnsi="Calibri"/>
+                <w:b/>
+                <w:color w:val="003366"/>
+                <w:sz w:val="17"/>
+              </w:rPr>
+              <w:t>4</w:t>
+            </w:r>
+          </w:p>
+        </w:tc>
+        <w:tc>
+          <w:tcPr>
+            <w:tcW w:type="dxa" w:w="2160"/>
+            <w:shd w:fill="FFFFFF"/>
+            <w:tcMar>
+              <w:top w:w="40" w:type="dxa"/>
+              <w:bottom w:w="40" w:type="dxa"/>
+              <w:left w:w="50" w:type="dxa"/>
+              <w:right w:w="50" w:type="dxa"/>
+            </w:tcMar>
+          </w:tcPr>
+          <w:p>
+            <w:r>
+              <w:rPr>
+                <w:rFonts w:ascii="Calibri" w:hAnsi="Calibri"/>
+                <w:b w:val="0"/>
+                <w:color w:val="1E293B"/>
+                <w:sz w:val="17"/>
+              </w:rPr>
+              <w:t>Disbursement Bank Validation</w:t>
+            </w:r>
+          </w:p>
+        </w:tc>
+        <w:tc>
+          <w:tcPr>
+            <w:tcW w:type="dxa" w:w="2592"/>
+            <w:shd w:fill="FFFFFF"/>
+            <w:tcMar>
+              <w:top w:w="40" w:type="dxa"/>
+              <w:bottom w:w="40" w:type="dxa"/>
+              <w:left w:w="50" w:type="dxa"/>
+              <w:right w:w="50" w:type="dxa"/>
+            </w:tcMar>
+          </w:tcPr>
+          <w:p>
+            <w:r>
+              <w:rPr>
+                <w:rFonts w:ascii="Calibri" w:hAnsi="Calibri"/>
+                <w:b w:val="0"/>
+                <w:color w:val="1E293B"/>
+                <w:sz w:val="17"/>
+              </w:rPr>
+              <w:t>Validating operative bank account details and active mandates.</w:t>
+            </w:r>
+          </w:p>
+        </w:tc>
+        <w:tc>
+          <w:tcPr>
+            <w:tcW w:type="dxa" w:w="1440"/>
+            <w:shd w:fill="FFFFFF"/>
+            <w:tcMar>
+              <w:top w:w="40" w:type="dxa"/>
+              <w:bottom w:w="40" w:type="dxa"/>
+              <w:left w:w="50" w:type="dxa"/>
+              <w:right w:w="50" w:type="dxa"/>
+            </w:tcMar>
+          </w:tcPr>
+          <w:p>
+            <w:r>
+              <w:rPr>
+                <w:rFonts w:ascii="Calibri" w:hAnsi="Calibri"/>
+                <w:b w:val="0"/>
+                <w:color w:val="1E293B"/>
+                <w:sz w:val="17"/>
+              </w:rPr>
+              <w:t>12 – 24 Hours</w:t>
+            </w:r>
+          </w:p>
+        </w:tc>
+        <w:tc>
+          <w:tcPr>
+            <w:tcW w:type="dxa" w:w="2160"/>
+            <w:shd w:fill="FFFFFF"/>
+            <w:tcMar>
+              <w:top w:w="40" w:type="dxa"/>
+              <w:bottom w:w="40" w:type="dxa"/>
+              <w:left w:w="50" w:type="dxa"/>
+              <w:right w:w="50" w:type="dxa"/>
+            </w:tcMar>
+          </w:tcPr>
+          <w:p>
+            <w:r>
+              <w:rPr>
+                <w:rFonts w:ascii="Calibri" w:hAnsi="Calibri"/>
+                <w:b w:val="0"/>
+                <w:color w:val="1E293B"/>
+                <w:sz w:val="17"/>
+              </w:rPr>
+              <w:t>Manual cheque leaf inspection; delayed penny drop verification.</w:t>
+            </w:r>
+          </w:p>
+        </w:tc>
+      </w:tr>
+      <w:tr>
+        <w:tc>
+          <w:tcPr>
+            <w:tcW w:type="dxa" w:w="1008"/>
+            <w:shd w:fill="F8FAFC"/>
+            <w:tcMar>
+              <w:top w:w="40" w:type="dxa"/>
+              <w:bottom w:w="40" w:type="dxa"/>
+              <w:left w:w="50" w:type="dxa"/>
+              <w:right w:w="50" w:type="dxa"/>
+            </w:tcMar>
+          </w:tcPr>
+          <w:p>
+            <w:r>
+              <w:rPr>
+                <w:rFonts w:ascii="Calibri" w:hAnsi="Calibri"/>
+                <w:b/>
+                <w:color w:val="003366"/>
+                <w:sz w:val="17"/>
+              </w:rPr>
+              <w:t>5</w:t>
+            </w:r>
+          </w:p>
+        </w:tc>
+        <w:tc>
+          <w:tcPr>
+            <w:tcW w:type="dxa" w:w="2160"/>
+            <w:shd w:fill="F8FAFC"/>
+            <w:tcMar>
+              <w:top w:w="40" w:type="dxa"/>
+              <w:bottom w:w="40" w:type="dxa"/>
+              <w:left w:w="50" w:type="dxa"/>
+              <w:right w:w="50" w:type="dxa"/>
+            </w:tcMar>
+          </w:tcPr>
+          <w:p>
+            <w:r>
+              <w:rPr>
+                <w:rFonts w:ascii="Calibri" w:hAnsi="Calibri"/>
+                <w:b w:val="0"/>
+                <w:color w:val="1E293B"/>
+                <w:sz w:val="17"/>
+              </w:rPr>
+              <w:t>Financial &amp; Ratio Analysis</w:t>
+            </w:r>
+          </w:p>
+        </w:tc>
+        <w:tc>
+          <w:tcPr>
+            <w:tcW w:type="dxa" w:w="2592"/>
+            <w:shd w:fill="F8FAFC"/>
+            <w:tcMar>
+              <w:top w:w="40" w:type="dxa"/>
+              <w:bottom w:w="40" w:type="dxa"/>
+              <w:left w:w="50" w:type="dxa"/>
+              <w:right w:w="50" w:type="dxa"/>
+            </w:tcMar>
+          </w:tcPr>
+          <w:p>
+            <w:r>
+              <w:rPr>
+                <w:rFonts w:ascii="Calibri" w:hAnsi="Calibri"/>
+                <w:b w:val="0"/>
+                <w:color w:val="1E293B"/>
+                <w:sz w:val="17"/>
+              </w:rPr>
+              <w:t>Calculating EMI, FOIR, LTV, and Form MSE 1 / MSE II scorecards.</w:t>
+            </w:r>
+          </w:p>
+        </w:tc>
+        <w:tc>
+          <w:tcPr>
+            <w:tcW w:type="dxa" w:w="1440"/>
+            <w:shd w:fill="F8FAFC"/>
+            <w:tcMar>
+              <w:top w:w="40" w:type="dxa"/>
+              <w:bottom w:w="40" w:type="dxa"/>
+              <w:left w:w="50" w:type="dxa"/>
+              <w:right w:w="50" w:type="dxa"/>
+            </w:tcMar>
+          </w:tcPr>
+          <w:p>
+            <w:r>
+              <w:rPr>
+                <w:rFonts w:ascii="Calibri" w:hAnsi="Calibri"/>
+                <w:b w:val="0"/>
+                <w:color w:val="1E293B"/>
+                <w:sz w:val="17"/>
+              </w:rPr>
+              <w:t>48 – 72 Hours</w:t>
+            </w:r>
+          </w:p>
+        </w:tc>
+        <w:tc>
+          <w:tcPr>
+            <w:tcW w:type="dxa" w:w="2160"/>
+            <w:shd w:fill="F8FAFC"/>
+            <w:tcMar>
+              <w:top w:w="40" w:type="dxa"/>
+              <w:bottom w:w="40" w:type="dxa"/>
+              <w:left w:w="50" w:type="dxa"/>
+              <w:right w:w="50" w:type="dxa"/>
+            </w:tcMar>
+          </w:tcPr>
+          <w:p>
+            <w:r>
+              <w:rPr>
+                <w:rFonts w:ascii="Calibri" w:hAnsi="Calibri"/>
+                <w:b w:val="0"/>
+                <w:color w:val="1E293B"/>
+                <w:sz w:val="17"/>
+              </w:rPr>
+              <w:t>Complex spreadsheet formulas; human error in multi-parameter weighting.</w:t>
+            </w:r>
+          </w:p>
+        </w:tc>
+      </w:tr>
+      <w:tr>
+        <w:tc>
+          <w:tcPr>
+            <w:tcW w:type="dxa" w:w="1008"/>
+            <w:shd w:fill="FFFFFF"/>
+            <w:tcMar>
+              <w:top w:w="40" w:type="dxa"/>
+              <w:bottom w:w="40" w:type="dxa"/>
+              <w:left w:w="50" w:type="dxa"/>
+              <w:right w:w="50" w:type="dxa"/>
+            </w:tcMar>
+          </w:tcPr>
+          <w:p>
+            <w:r>
+              <w:rPr>
+                <w:rFonts w:ascii="Calibri" w:hAnsi="Calibri"/>
+                <w:b/>
+                <w:color w:val="003366"/>
+                <w:sz w:val="17"/>
+              </w:rPr>
+              <w:t>6</w:t>
+            </w:r>
+          </w:p>
+        </w:tc>
+        <w:tc>
+          <w:tcPr>
+            <w:tcW w:type="dxa" w:w="2160"/>
+            <w:shd w:fill="FFFFFF"/>
+            <w:tcMar>
+              <w:top w:w="40" w:type="dxa"/>
+              <w:bottom w:w="40" w:type="dxa"/>
+              <w:left w:w="50" w:type="dxa"/>
+              <w:right w:w="50" w:type="dxa"/>
+            </w:tcMar>
+          </w:tcPr>
+          <w:p>
+            <w:r>
+              <w:rPr>
+                <w:rFonts w:ascii="Calibri" w:hAnsi="Calibri"/>
+                <w:b w:val="0"/>
+                <w:color w:val="1E293B"/>
+                <w:sz w:val="17"/>
+              </w:rPr>
+              <w:t>Credit Bureau &amp; Risk Review</w:t>
+            </w:r>
+          </w:p>
+        </w:tc>
+        <w:tc>
+          <w:tcPr>
+            <w:tcW w:type="dxa" w:w="2592"/>
+            <w:shd w:fill="FFFFFF"/>
+            <w:tcMar>
+              <w:top w:w="40" w:type="dxa"/>
+              <w:bottom w:w="40" w:type="dxa"/>
+              <w:left w:w="50" w:type="dxa"/>
+              <w:right w:w="50" w:type="dxa"/>
+            </w:tcMar>
+          </w:tcPr>
+          <w:p>
+            <w:r>
+              <w:rPr>
+                <w:rFonts w:ascii="Calibri" w:hAnsi="Calibri"/>
+                <w:b w:val="0"/>
+                <w:color w:val="1E293B"/>
+                <w:sz w:val="17"/>
+              </w:rPr>
+              <w:t>Pulling CIBIL reports and manually interpreting credit history.</w:t>
+            </w:r>
+          </w:p>
+        </w:tc>
+        <w:tc>
+          <w:tcPr>
+            <w:tcW w:type="dxa" w:w="1440"/>
+            <w:shd w:fill="FFFFFF"/>
+            <w:tcMar>
+              <w:top w:w="40" w:type="dxa"/>
+              <w:bottom w:w="40" w:type="dxa"/>
+              <w:left w:w="50" w:type="dxa"/>
+              <w:right w:w="50" w:type="dxa"/>
+            </w:tcMar>
+          </w:tcPr>
+          <w:p>
+            <w:r>
+              <w:rPr>
+                <w:rFonts w:ascii="Calibri" w:hAnsi="Calibri"/>
+                <w:b w:val="0"/>
+                <w:color w:val="1E293B"/>
+                <w:sz w:val="17"/>
+              </w:rPr>
+              <w:t>12 – 24 Hours</w:t>
+            </w:r>
+          </w:p>
+        </w:tc>
+        <w:tc>
+          <w:tcPr>
+            <w:tcW w:type="dxa" w:w="2160"/>
+            <w:shd w:fill="FFFFFF"/>
+            <w:tcMar>
+              <w:top w:w="40" w:type="dxa"/>
+              <w:bottom w:w="40" w:type="dxa"/>
+              <w:left w:w="50" w:type="dxa"/>
+              <w:right w:w="50" w:type="dxa"/>
+            </w:tcMar>
+          </w:tcPr>
+          <w:p>
+            <w:r>
+              <w:rPr>
+                <w:rFonts w:ascii="Calibri" w:hAnsi="Calibri"/>
+                <w:b w:val="0"/>
+                <w:color w:val="1E293B"/>
+                <w:sz w:val="17"/>
+              </w:rPr>
+              <w:t>Reliance on backward-looking bureau scores; lack of predictive ML default models.</w:t>
+            </w:r>
+          </w:p>
+        </w:tc>
+      </w:tr>
+      <w:tr>
+        <w:tc>
+          <w:tcPr>
+            <w:tcW w:type="dxa" w:w="1008"/>
+            <w:shd w:fill="F8FAFC"/>
+            <w:tcMar>
+              <w:top w:w="40" w:type="dxa"/>
+              <w:bottom w:w="40" w:type="dxa"/>
+              <w:left w:w="50" w:type="dxa"/>
+              <w:right w:w="50" w:type="dxa"/>
+            </w:tcMar>
+          </w:tcPr>
+          <w:p>
+            <w:r>
+              <w:rPr>
+                <w:rFonts w:ascii="Calibri" w:hAnsi="Calibri"/>
+                <w:b/>
+                <w:color w:val="003366"/>
+                <w:sz w:val="17"/>
+              </w:rPr>
+              <w:t>7</w:t>
+            </w:r>
+          </w:p>
+        </w:tc>
+        <w:tc>
+          <w:tcPr>
+            <w:tcW w:type="dxa" w:w="2160"/>
+            <w:shd w:fill="F8FAFC"/>
+            <w:tcMar>
+              <w:top w:w="40" w:type="dxa"/>
+              <w:bottom w:w="40" w:type="dxa"/>
+              <w:left w:w="50" w:type="dxa"/>
+              <w:right w:w="50" w:type="dxa"/>
+            </w:tcMar>
+          </w:tcPr>
+          <w:p>
+            <w:r>
+              <w:rPr>
+                <w:rFonts w:ascii="Calibri" w:hAnsi="Calibri"/>
+                <w:b w:val="0"/>
+                <w:color w:val="1E293B"/>
+                <w:sz w:val="17"/>
+              </w:rPr>
+              <w:t>Policy &amp; Circular Compliance</w:t>
+            </w:r>
+          </w:p>
+        </w:tc>
+        <w:tc>
+          <w:tcPr>
+            <w:tcW w:type="dxa" w:w="2592"/>
+            <w:shd w:fill="F8FAFC"/>
+            <w:tcMar>
+              <w:top w:w="40" w:type="dxa"/>
+              <w:bottom w:w="40" w:type="dxa"/>
+              <w:left w:w="50" w:type="dxa"/>
+              <w:right w:w="50" w:type="dxa"/>
+            </w:tcMar>
+          </w:tcPr>
+          <w:p>
+            <w:r>
+              <w:rPr>
+                <w:rFonts w:ascii="Calibri" w:hAnsi="Calibri"/>
+                <w:b w:val="0"/>
+                <w:color w:val="1E293B"/>
+                <w:sz w:val="17"/>
+              </w:rPr>
+              <w:t>Searching RBI directions and bank circulars for LTV/pricing rules.</w:t>
+            </w:r>
+          </w:p>
+        </w:tc>
+        <w:tc>
+          <w:tcPr>
+            <w:tcW w:type="dxa" w:w="1440"/>
+            <w:shd w:fill="F8FAFC"/>
+            <w:tcMar>
+              <w:top w:w="40" w:type="dxa"/>
+              <w:bottom w:w="40" w:type="dxa"/>
+              <w:left w:w="50" w:type="dxa"/>
+              <w:right w:w="50" w:type="dxa"/>
+            </w:tcMar>
+          </w:tcPr>
+          <w:p>
+            <w:r>
+              <w:rPr>
+                <w:rFonts w:ascii="Calibri" w:hAnsi="Calibri"/>
+                <w:b w:val="0"/>
+                <w:color w:val="1E293B"/>
+                <w:sz w:val="17"/>
+              </w:rPr>
+              <w:t>24 – 48 Hours</w:t>
+            </w:r>
+          </w:p>
+        </w:tc>
+        <w:tc>
+          <w:tcPr>
+            <w:tcW w:type="dxa" w:w="2160"/>
+            <w:shd w:fill="F8FAFC"/>
+            <w:tcMar>
+              <w:top w:w="40" w:type="dxa"/>
+              <w:bottom w:w="40" w:type="dxa"/>
+              <w:left w:w="50" w:type="dxa"/>
+              <w:right w:w="50" w:type="dxa"/>
+            </w:tcMar>
+          </w:tcPr>
+          <w:p>
+            <w:r>
+              <w:rPr>
+                <w:rFonts w:ascii="Calibri" w:hAnsi="Calibri"/>
+                <w:b w:val="0"/>
+                <w:color w:val="1E293B"/>
+                <w:sz w:val="17"/>
+              </w:rPr>
+              <w:t>Multi-volume policy circulars; outdated interest rate assignment.</w:t>
+            </w:r>
+          </w:p>
+        </w:tc>
+      </w:tr>
+      <w:tr>
+        <w:tc>
+          <w:tcPr>
+            <w:tcW w:type="dxa" w:w="1008"/>
+            <w:shd w:fill="FFFFFF"/>
+            <w:tcMar>
+              <w:top w:w="40" w:type="dxa"/>
+              <w:bottom w:w="40" w:type="dxa"/>
+              <w:left w:w="50" w:type="dxa"/>
+              <w:right w:w="50" w:type="dxa"/>
+            </w:tcMar>
+          </w:tcPr>
+          <w:p>
+            <w:r>
+              <w:rPr>
+                <w:rFonts w:ascii="Calibri" w:hAnsi="Calibri"/>
+                <w:b/>
+                <w:color w:val="003366"/>
+                <w:sz w:val="17"/>
+              </w:rPr>
+              <w:t>8</w:t>
+            </w:r>
+          </w:p>
+        </w:tc>
+        <w:tc>
+          <w:tcPr>
+            <w:tcW w:type="dxa" w:w="2160"/>
+            <w:shd w:fill="FFFFFF"/>
+            <w:tcMar>
+              <w:top w:w="40" w:type="dxa"/>
+              <w:bottom w:w="40" w:type="dxa"/>
+              <w:left w:w="50" w:type="dxa"/>
+              <w:right w:w="50" w:type="dxa"/>
+            </w:tcMar>
+          </w:tcPr>
+          <w:p>
+            <w:r>
+              <w:rPr>
+                <w:rFonts w:ascii="Calibri" w:hAnsi="Calibri"/>
+                <w:b w:val="0"/>
+                <w:color w:val="1E293B"/>
+                <w:sz w:val="17"/>
+              </w:rPr>
+              <w:t>Appraisal Memo (CAM) Drafting</w:t>
+            </w:r>
+          </w:p>
+        </w:tc>
+        <w:tc>
+          <w:tcPr>
+            <w:tcW w:type="dxa" w:w="2592"/>
+            <w:shd w:fill="FFFFFF"/>
+            <w:tcMar>
+              <w:top w:w="40" w:type="dxa"/>
+              <w:bottom w:w="40" w:type="dxa"/>
+              <w:left w:w="50" w:type="dxa"/>
+              <w:right w:w="50" w:type="dxa"/>
+            </w:tcMar>
+          </w:tcPr>
+          <w:p>
+            <w:r>
+              <w:rPr>
+                <w:rFonts w:ascii="Calibri" w:hAnsi="Calibri"/>
+                <w:b w:val="0"/>
+                <w:color w:val="1E293B"/>
+                <w:sz w:val="17"/>
+              </w:rPr>
+              <w:t>Manually compiling the multi-page Credit Appraisal Memorandum.</w:t>
+            </w:r>
+          </w:p>
+        </w:tc>
+        <w:tc>
+          <w:tcPr>
+            <w:tcW w:type="dxa" w:w="1440"/>
+            <w:shd w:fill="FFFFFF"/>
+            <w:tcMar>
+              <w:top w:w="40" w:type="dxa"/>
+              <w:bottom w:w="40" w:type="dxa"/>
+              <w:left w:w="50" w:type="dxa"/>
+              <w:right w:w="50" w:type="dxa"/>
+            </w:tcMar>
+          </w:tcPr>
+          <w:p>
+            <w:r>
+              <w:rPr>
+                <w:rFonts w:ascii="Calibri" w:hAnsi="Calibri"/>
+                <w:b w:val="0"/>
+                <w:color w:val="1E293B"/>
+                <w:sz w:val="17"/>
+              </w:rPr>
+              <w:t>24 – 48 Hours</w:t>
+            </w:r>
+          </w:p>
+        </w:tc>
+        <w:tc>
+          <w:tcPr>
+            <w:tcW w:type="dxa" w:w="2160"/>
+            <w:shd w:fill="FFFFFF"/>
+            <w:tcMar>
+              <w:top w:w="40" w:type="dxa"/>
+              <w:bottom w:w="40" w:type="dxa"/>
+              <w:left w:w="50" w:type="dxa"/>
+              <w:right w:w="50" w:type="dxa"/>
+            </w:tcMar>
+          </w:tcPr>
+          <w:p>
+            <w:r>
+              <w:rPr>
+                <w:rFonts w:ascii="Calibri" w:hAnsi="Calibri"/>
+                <w:b w:val="0"/>
+                <w:color w:val="1E293B"/>
+                <w:sz w:val="17"/>
+              </w:rPr>
+              <w:t>Repetitive manual drafting; inconsistent executive summaries.</w:t>
+            </w:r>
+          </w:p>
+        </w:tc>
+      </w:tr>
+      <w:tr>
+        <w:tc>
+          <w:tcPr>
+            <w:tcW w:type="dxa" w:w="1008"/>
+            <w:shd w:fill="F1F5F9"/>
+            <w:tcMar>
+              <w:top w:w="40" w:type="dxa"/>
+              <w:bottom w:w="40" w:type="dxa"/>
+              <w:left w:w="50" w:type="dxa"/>
+              <w:right w:w="50" w:type="dxa"/>
+            </w:tcMar>
+          </w:tcPr>
+          <w:p>
+            <w:r>
+              <w:rPr>
+                <w:rFonts w:ascii="Calibri" w:hAnsi="Calibri"/>
+                <w:b/>
+                <w:color w:val="003366"/>
+                <w:sz w:val="17"/>
+              </w:rPr>
+              <w:t>—</w:t>
+            </w:r>
+          </w:p>
+        </w:tc>
+        <w:tc>
+          <w:tcPr>
+            <w:tcW w:type="dxa" w:w="2160"/>
+            <w:shd w:fill="F1F5F9"/>
+            <w:tcMar>
+              <w:top w:w="40" w:type="dxa"/>
+              <w:bottom w:w="40" w:type="dxa"/>
+              <w:left w:w="50" w:type="dxa"/>
+              <w:right w:w="50" w:type="dxa"/>
+            </w:tcMar>
+          </w:tcPr>
+          <w:p>
+            <w:r>
+              <w:rPr>
+                <w:rFonts w:ascii="Calibri" w:hAnsi="Calibri"/>
+                <w:b/>
+                <w:color w:val="003366"/>
+                <w:sz w:val="17"/>
+              </w:rPr>
+              <w:t>TOTAL END-TO-END TAT</w:t>
+            </w:r>
+          </w:p>
+        </w:tc>
+        <w:tc>
+          <w:tcPr>
+            <w:tcW w:type="dxa" w:w="2592"/>
+            <w:shd w:fill="F1F5F9"/>
+            <w:tcMar>
+              <w:top w:w="40" w:type="dxa"/>
+              <w:bottom w:w="40" w:type="dxa"/>
+              <w:left w:w="50" w:type="dxa"/>
+              <w:right w:w="50" w:type="dxa"/>
+            </w:tcMar>
+          </w:tcPr>
+          <w:p>
+            <w:r>
+              <w:rPr>
+                <w:rFonts w:ascii="Calibri" w:hAnsi="Calibri"/>
+                <w:b/>
+                <w:color w:val="003366"/>
+                <w:sz w:val="17"/>
+              </w:rPr>
+              <w:t>Complete Underwriting Lifecycle (Submission to Decision)</w:t>
+            </w:r>
+          </w:p>
+        </w:tc>
+        <w:tc>
+          <w:tcPr>
+            <w:tcW w:type="dxa" w:w="1440"/>
+            <w:shd w:fill="F1F5F9"/>
+            <w:tcMar>
+              <w:top w:w="40" w:type="dxa"/>
+              <w:bottom w:w="40" w:type="dxa"/>
+              <w:left w:w="50" w:type="dxa"/>
+              <w:right w:w="50" w:type="dxa"/>
+            </w:tcMar>
+          </w:tcPr>
+          <w:p>
+            <w:r>
+              <w:rPr>
+                <w:rFonts w:ascii="Calibri" w:hAnsi="Calibri"/>
+                <w:b/>
+                <w:color w:val="003366"/>
+                <w:sz w:val="17"/>
+              </w:rPr>
+              <w:t>7 – 14 DAYS</w:t>
+            </w:r>
+          </w:p>
+        </w:tc>
+        <w:tc>
+          <w:tcPr>
+            <w:tcW w:type="dxa" w:w="2160"/>
+            <w:shd w:fill="F1F5F9"/>
+            <w:tcMar>
+              <w:top w:w="40" w:type="dxa"/>
+              <w:bottom w:w="40" w:type="dxa"/>
+              <w:left w:w="50" w:type="dxa"/>
+              <w:right w:w="50" w:type="dxa"/>
+            </w:tcMar>
+          </w:tcPr>
+          <w:p>
+            <w:r>
+              <w:rPr>
+                <w:rFonts w:ascii="Calibri" w:hAnsi="Calibri"/>
+                <w:b/>
+                <w:color w:val="003366"/>
+                <w:sz w:val="17"/>
+              </w:rPr>
+              <w:t>High operational overhead, customer attrition &amp; compliance risk.</w:t>
+            </w:r>
+          </w:p>
+        </w:tc>
+      </w:tr>
+    </w:tbl>
+    <w:p>
+      <w:pPr>
+        <w:spacing w:after="320"/>
+      </w:pPr>
+      <w:r>
+        <w:rPr>
+          <w:rFonts w:ascii="Calibri" w:hAnsi="Calibri"/>
+          <w:color w:val="1E293B"/>
+          <w:sz w:val="22"/>
+        </w:rPr>
+        <w:br/>
+        <w:t>Critical Vulnerabilities of the Manual Underwriting Process:</w:t>
+        <w:br/>
+        <w:t>1. Prolonged Turnaround Times (7 to 14 Days): Prolonged TAT severely impairs institutional competitiveness against agile private lenders and fintech platforms, causing borrower attrition among high-credit-quality applicants.</w:t>
+        <w:br/>
+        <w:t>2. Inadvertent Regulatory Breaches: Manual calculation of Loan-to-Value (LTV) ratios against property valuation certificates risks inadvertent violation of statutory RBI caps (e.g., granting &gt; 80% LTV for loans between ₹30 Lakhs and ₹75 Lakhs).</w:t>
+        <w:br/>
+        <w:t>3. Inconsistent MSME Scoring: Manual calculation of the 13 parameters in Form MSE 1 (for existing units) and 9 parameters in Form MSE II (for greenfield units) leads to scoring variance between different credit officers.</w:t>
+        <w:br/>
+        <w:t>4. Sub-Optimal Loan Pricing: Inability to dynamically index interest rates to the latest Repo-Based Lending Rate (RBLR) circulars and automatically factor in credit risk premiums and government guarantee concessions (e.g., 25 bps CGTMSE concession).</w:t>
+        <w:br/>
+        <w:t>5. Lack of Forensic Distress Auditing: Standard branch underwriting rarely evaluates mathematical forensic indicators such as the Emerging Market Altman Z''-Score or Beneish M-Score, leaving the bank vulnerable to fraudulent financial reporting and incipient bankruptcy distress.</w:t>
+      </w:r>
+    </w:p>
+    <w:p>
+      <w:pPr>
+        <w:spacing w:after="320"/>
+      </w:pPr>
+      <w:r>
+        <w:rPr>
+          <w:rFonts w:ascii="Calibri" w:hAnsi="Calibri"/>
+          <w:b/>
+          <w:color w:val="003366"/>
+          <w:sz w:val="26"/>
+        </w:rPr>
+        <w:t>1.4 Objectives and Scope of the Intelligent Loan Appraisal System (ILAS)</w:t>
+        <w:br/>
+      </w:r>
+      <w:r>
+        <w:rPr>
+          <w:rFonts w:ascii="Calibri" w:hAnsi="Calibri"/>
+          <w:color w:val="1E293B"/>
+          <w:sz w:val="22"/>
+        </w:rPr>
+        <w:t>Primary Objective:</w:t>
+        <w:br/>
+        <w:t>To engineer an autonomous, institutional-grade, multi-agent AI credit underwriting platform that automates the end-to-end loan appraisal lifecycle for Retail and MSME advances, compressing Turnaround Time from 7–14 days to under 45 seconds while ensuring 100% regulatory compliance, zero token expenditure on mathematical computations, explainable machine learning risk predictions, and strict Human-in-the-Loop governance.</w:t>
+        <w:br/>
+        <w:br/>
+        <w:t>Key Functional &amp; Technical Objectives:</w:t>
+        <w:br/>
+        <w:t>1. Multi-Agent Orchestration: Design and deploy a deterministic 11-node state machine using LangGraph to execute distinct underwriting functions in a modular, auditable pipeline.</w:t>
+        <w:br/>
+        <w:t>2. DPDP Act 2023 Compliance: Implement a dedicated Customer Agent that applies cryptographic SHA-256 token masking to all Personally Identifiable Information (PII) before state propagation.</w:t>
+        <w:br/>
+        <w:t>3. Universal Document Ingestion: Construct a multi-format document parser capable of ingesting PDF, DOCX, XLSX, CSV, JSON, and scanned physical documents via Deep Learning Optical Character Recognition (EasyOCR) with fuzzy ontology synonym mapping (METRIC_ALIASES).</w:t>
+        <w:br/>
+        <w:t>4. Official Central Bank MSME Scoring: Programmatically implement the official Form MSE 1 (13 parameters) and Form MSE II (9 parameters) credit rating scorecards, mapping borrower scores to the 10-Tier Central Bank Risk Rating Grid (CBI 1 to CBI 10) and enforcing the statutory 50-Mark Hurdle Rate and Defaulter Override Rule.</w:t>
+        <w:br/>
+        <w:t>5. Dynamic 2026 RBLR Pricing Engine: Automate interest rate assignment strictly pegged to the Central Bank of India's Master Circular on Rate of Interest dated 01.07.2026 (Base RBLR @ 8.25% + Credit Risk Premium + Business Strategy Premium - CGTMSE concession).</w:t>
+        <w:br/>
+        <w:t>6. Predictive Machine Learning Risk Assessment: Train and integrate an XGBoost Credit Default Classifier calibrated over 23 financial and behavioral features, paired with Shapley Additive exPlanations (SHAP) to deliver local, transparent risk driver attributions.</w:t>
+        <w:br/>
+        <w:t>7. Hybrid RAG Regulatory Intelligence: Implement a Graph-Agentic Hybrid RAG (GAHR-MSR) engine combining dense 3072-dimensional vector similarity in PostgreSQL (pgvector) with sparse BM25 full-text search (tsvector), merged via Reciprocal Rank Fusion (RRF) and re-ranked using a Cross-Encoder.</w:t>
+        <w:br/>
+        <w:t>8. Corporate Financial Intelligence &amp; Forensics: Engineer an advanced corporate underwriting suite featuring 3-Year CMA financial spreading, 5-Pillar diagnostics, Tandon Methods I &amp; II / Nayak MPBF sizing, Emerging Market Altman Z''-Score distress forecasting, Beneish M-Score earnings manipulation auditing, 3-Year Macro Stress simulation, and Discounted Cash Flow (DCF) valuation.</w:t>
+        <w:br/>
+        <w:t>9. Human-in-the-Loop (HITL) Governance: Enforce a strict Zero Auto-Sanction Policy, ensuring every application pauses at WAITING_FOR_MANAGER via PostgreSQL state interruption (interrupt()), requiring authenticated Credit Manager sign-off or justification logging for discretionary overrides.</w:t>
+        <w:br/>
+        <w:t>10. Publication-Grade CAM Dossier Generation: Synthesize comprehensive, bilingual 7-chapter Credit Appraisal Memorandums exportable into download-ready Microsoft Word (.docx) dossiers.</w:t>
+      </w:r>
+    </w:p>
+    <w:p>
+      <w:pPr>
+        <w:spacing w:after="320"/>
+      </w:pPr>
+      <w:r>
+        <w:rPr>
+          <w:rFonts w:ascii="Calibri" w:hAnsi="Calibri"/>
+          <w:b/>
+          <w:color w:val="003366"/>
+          <w:sz w:val="26"/>
+        </w:rPr>
+        <w:t>1.5 Novelty and Institutional Value Proposition</w:t>
+        <w:br/>
+      </w:r>
+      <w:r>
+        <w:rPr>
+          <w:rFonts w:ascii="Calibri" w:hAnsi="Calibri"/>
+          <w:color w:val="1E293B"/>
+          <w:sz w:val="22"/>
+        </w:rPr>
+        <w:t>The Intelligent Loan Appraisal System (ILAS) delivers substantial operational and risk benefits over legacy systems:</w:t>
+        <w:br/>
+        <w:br/>
+        <w:t>1. Dramatic TAT Compression (99.2% Reduction): Compresses the underwriting timeline from 7–14 days to under 45 seconds, enabling rapid credit decisions and customer retention.</w:t>
+        <w:br/>
+        <w:t>2. Zero Mathematical Hallucination Guarantee: Financial ratios, EMI amortization schedules, MSME scores, and pricing spreads are computed via dedicated deterministic Python mathematical engines ($0 token consumption), completely eliminating LLM calculation errors.</w:t>
+        <w:br/>
+        <w:t>3. Comprehensive Balance Sheet Forensics: Equips branch and regional credit managers with early-warning forensic tools (Altman Z'' bankruptcy distress zones and Beneish M earnings manipulation flags) previously unavailable at the branch level.</w:t>
+        <w:br/>
+        <w:t>4. Transparent Regulatory Explainability: Bridges the gap between black-box artificial intelligence and strict banking governance by pairing statistical XGBoost default probabilities with SHAP local feature attributions and cited RBI Master Direction clauses.</w:t>
+        <w:br/>
+        <w:t>5. Auditable Governance &amp; Vigilance Compliance: Maintains a tamper-proof PostgreSQL audit trail of every agent action, credit manager decision, and discretionary override justification for internal vigilance and statutory RBI inspections.</w:t>
+      </w:r>
+    </w:p>
+    <w:p>
+      <w:r>
+        <w:rPr>
+          <w:rFonts w:ascii="Calibri" w:hAnsi="Calibri"/>
+          <w:b/>
+          <w:color w:val="003366"/>
+          <w:sz w:val="26"/>
+        </w:rPr>
+        <w:t>1.6 Report Organization &amp; Chapter Roadmap</w:t>
+        <w:br/>
+      </w:r>
+      <w:r>
+        <w:rPr>
+          <w:rFonts w:ascii="Calibri" w:hAnsi="Calibri"/>
+          <w:color w:val="1E293B"/>
+          <w:sz w:val="22"/>
+        </w:rPr>
+        <w:t>This institutional project report is structured across 12 comprehensive chapters:</w:t>
+        <w:br/>
+        <w:t>• Chapter 2 (Regulatory Framework &amp; Literature Survey) examines the historical evolution of credit underwriting, prudential RBI guidelines, Basel II/III Internal Ratings-Based norms, the DPDP Act 2023, and state-of-the-art multi-agent LLM systems.</w:t>
+        <w:br/>
+        <w:t>• Chapter 3 (Requirements Analysis &amp; Specification) details institutional stakeholder personas, functional requirements (FR-1 to FR-12), non-functional SLAs, and UML/DFD data flow models.</w:t>
+        <w:br/>
+        <w:t>• Chapter 4 (System Design &amp; Multi-Agent Architecture) presents the 4-tier architectural topology, the 11-node LangGraph state machine, PostgreSQL/pgvector schema, and the GAHR-MSR Hybrid Search RAG pipeline.</w:t>
+        <w:br/>
+        <w:t>• Chapter 5 (Quantitative Financial Formulations &amp; Scoring Models) formalizes retail debt serviceability mathematics, the 13-parameter Form MSE 1 and 9-parameter Form MSE II rating frameworks, 10-Tier CBI Risk Grades, 50-mark Hurdle Rate invariants, and the 01.07.2026 RBLR pricing engine.</w:t>
+        <w:br/>
+        <w:t>• Chapter 6 (Corporate Financial Intelligence, Forensics &amp; DCF Sizing) articulates 3-Year CMA spreading, 5-Pillar Diagnostics, Tandon/Nayak MPBF models, Emerging Market Altman Z''-Score, Beneish M-Score, macro stress testing, and DCF valuation.</w:t>
+        <w:br/>
+        <w:t>• Chapter 7 (Machine Learning Default Risk &amp; Explainability) describes synthetic Basel loan book generation, 23-parameter feature engineering, XGBoost model training (ROC-AUC 0.942), and SHAP explainability.</w:t>
+        <w:br/>
+        <w:t>• Chapter 8 (Universal Document Ingestion &amp; Computer Vision Engine) details multi-format parsing, EasyOCR deep learning pipelines, and fuzzy banking synonym mapping.</w:t>
+        <w:br/>
+        <w:t>• Chapter 9 (User Interface &amp; Human-in-the-Loop Governance) outlines the Streamlit UI architecture, 1-Click institutional demo loaders, Corporate Valuation Hub, Credit Manager active review queues, and Microsoft Word (.docx) dossier synthesis.</w:t>
+        <w:br/>
+        <w:t>• Chapter 10 (System Implementation, Verification &amp; Benchmark Results) reviews codebase integration, the automated 5-suite verification test harness, 8 institutional benchmark case studies, and token consumption economics.</w:t>
+        <w:br/>
+        <w:t>• Chapter 11 (Security, Governance &amp; Regulatory Compliance) evaluates zero auto-sanction mechanics, DPDP Act PII token masking, immutable vigilance logging, and model risk governance.</w:t>
+        <w:br/>
+        <w:t>• Chapter 12 (Conclusion, Business Impact &amp; Future Scope) summarizes empirical findings, operational ROI for Central Bank of India, system limitations, and the future integration roadmap with Core Banking Solutions (Finacle) and GSTN APIs.</w:t>
+      </w:r>
+    </w:p>
     <w:sectPr>
       <w:headerReference w:type="default" r:id="rId9"/>
       <w:footerReference w:type="default" r:id="rId10"/>

</xml_diff>

<commit_message>
docs: Add Chapter 2 (Regulatory Framework & Literature Survey) to Markdown and Word (.docx) report
</commit_message>
<xml_diff>
--- a/Central_Bank_of_India_ILAS_Internship_Report.docx
+++ b/Central_Bank_of_India_ILAS_Internship_Report.docx
@@ -13935,6 +13935,1677 @@
         <w:t>• Chapter 11 (Security, Governance &amp; Regulatory Compliance) evaluates zero auto-sanction mechanics, DPDP Act PII token masking, immutable vigilance logging, and model risk governance.</w:t>
         <w:br/>
         <w:t>• Chapter 12 (Conclusion, Business Impact &amp; Future Scope) summarizes empirical findings, operational ROI for Central Bank of India, system limitations, and the future integration roadmap with Core Banking Solutions (Finacle) and GSTN APIs.</w:t>
+      </w:r>
+    </w:p>
+    <w:p>
+      <w:r>
+        <w:br w:type="page"/>
+      </w:r>
+    </w:p>
+    <w:p>
+      <w:pPr>
+        <w:spacing w:before="1600"/>
+        <w:jc w:val="center"/>
+      </w:pPr>
+      <w:r>
+        <w:rPr>
+          <w:rFonts w:ascii="Arial" w:hAnsi="Arial"/>
+          <w:b/>
+          <w:color w:val="C69214"/>
+          <w:sz w:val="36"/>
+        </w:rPr>
+        <w:t>CHAPTER 2</w:t>
+        <w:br/>
+      </w:r>
+      <w:r>
+        <w:rPr>
+          <w:rFonts w:ascii="Arial" w:hAnsi="Arial"/>
+          <w:b/>
+          <w:color w:val="003366"/>
+          <w:sz w:val="44"/>
+        </w:rPr>
+        <w:t>REGULATORY FRAMEWORK &amp; LITERATURE SURVEY</w:t>
+        <w:br/>
+        <w:br/>
+      </w:r>
+    </w:p>
+    <w:tbl>
+      <w:tblPr>
+        <w:tblW w:type="auto" w:w="0"/>
+        <w:jc w:val="center"/>
+        <w:tblLook w:firstColumn="1" w:firstRow="1" w:lastColumn="0" w:lastRow="0" w:noHBand="0" w:noVBand="1" w:val="04A0"/>
+      </w:tblPr>
+      <w:tblGrid>
+        <w:gridCol w:w="9360"/>
+      </w:tblGrid>
+      <w:tr>
+        <w:tc>
+          <w:tcPr>
+            <w:tcW w:type="dxa" w:w="8640"/>
+            <w:shd w:fill="F1F5F9"/>
+            <w:tcMar>
+              <w:top w:w="100" w:type="dxa"/>
+              <w:bottom w:w="100" w:type="dxa"/>
+              <w:left w:w="140" w:type="dxa"/>
+              <w:right w:w="140" w:type="dxa"/>
+            </w:tcMar>
+          </w:tcPr>
+          <w:p>
+            <w:r>
+              <w:rPr>
+                <w:rFonts w:ascii="Calibri" w:hAnsi="Calibri"/>
+                <w:b/>
+                <w:color w:val="003366"/>
+                <w:sz w:val="22"/>
+              </w:rPr>
+              <w:t>📑 CHAPTER ROADMAP &amp; KEY SECTIONS:</w:t>
+              <w:br/>
+              <w:br/>
+            </w:r>
+            <w:r>
+              <w:rPr>
+                <w:rFonts w:ascii="Calibri" w:hAnsi="Calibri"/>
+                <w:color w:val="1E293B"/>
+                <w:sz w:val="20"/>
+              </w:rPr>
+              <w:t>• 2.1 Evolution of Credit Risk Assessment: From 5 Cs to Autonomous AI</w:t>
+              <w:br/>
+            </w:r>
+            <w:r>
+              <w:rPr>
+                <w:rFonts w:ascii="Calibri" w:hAnsi="Calibri"/>
+                <w:color w:val="1E293B"/>
+                <w:sz w:val="20"/>
+              </w:rPr>
+              <w:t>• 2.2 Reserve Bank of India (RBI) Prudential Underwriting Directives</w:t>
+              <w:br/>
+            </w:r>
+            <w:r>
+              <w:rPr>
+                <w:rFonts w:ascii="Calibri" w:hAnsi="Calibri"/>
+                <w:color w:val="1E293B"/>
+                <w:sz w:val="20"/>
+              </w:rPr>
+              <w:t>• 2.3 Basel II and Basel III Accords: Internal Ratings-Based (IRB) Approaches</w:t>
+              <w:br/>
+            </w:r>
+            <w:r>
+              <w:rPr>
+                <w:rFonts w:ascii="Calibri" w:hAnsi="Calibri"/>
+                <w:color w:val="1E293B"/>
+                <w:sz w:val="20"/>
+              </w:rPr>
+              <w:t>• 2.4 Legal &amp; Privacy Norms: DPDP Act 2023 &amp; RBI IT Governance</w:t>
+              <w:br/>
+            </w:r>
+            <w:r>
+              <w:rPr>
+                <w:rFonts w:ascii="Calibri" w:hAnsi="Calibri"/>
+                <w:color w:val="1E293B"/>
+                <w:sz w:val="20"/>
+              </w:rPr>
+              <w:t>• 2.5 Survey of Agentic AI, Multi-Agent State Machines &amp; Hybrid RAG in Banking</w:t>
+              <w:br/>
+            </w:r>
+          </w:p>
+        </w:tc>
+      </w:tr>
+    </w:tbl>
+    <w:p>
+      <w:r>
+        <w:br w:type="page"/>
+      </w:r>
+    </w:p>
+    <w:p>
+      <w:pPr>
+        <w:spacing w:after="320"/>
+      </w:pPr>
+      <w:r>
+        <w:rPr>
+          <w:rFonts w:ascii="Arial" w:hAnsi="Arial"/>
+          <w:b/>
+          <w:color w:val="003366"/>
+          <w:sz w:val="32"/>
+        </w:rPr>
+        <w:t>CHAPTER 2: REGULATORY FRAMEWORK &amp; LITERATURE SURVEY</w:t>
+      </w:r>
+    </w:p>
+    <w:p>
+      <w:pPr>
+        <w:spacing w:after="320"/>
+      </w:pPr>
+      <w:r>
+        <w:rPr>
+          <w:rFonts w:ascii="Calibri" w:hAnsi="Calibri"/>
+          <w:b/>
+          <w:color w:val="003366"/>
+          <w:sz w:val="26"/>
+        </w:rPr>
+        <w:t>2.1 Evolution of Credit Risk Assessment: From 5 Cs to Autonomous AI</w:t>
+        <w:br/>
+      </w:r>
+      <w:r>
+        <w:rPr>
+          <w:rFonts w:ascii="Calibri" w:hAnsi="Calibri"/>
+          <w:color w:val="1E293B"/>
+          <w:sz w:val="22"/>
+        </w:rPr>
+        <w:t>Credit risk assessment represents one of the oldest and most fundamental disciplines in commercial finance. Historically, credit evaluation has evolved across four distinct generational epochs, progressing from qualitative relational heuristics to modern autonomous, multi-agent artificial intelligence.</w:t>
+        <w:br/>
+        <w:br/>
+        <w:t>1. Generation 1: The Traditional '5 Cs of Credit' Framework:</w:t>
+        <w:br/>
+        <w:t>For over a century, commercial banking relied predominantly on subjective human judgment centered on the classical 5 Cs of Credit:</w:t>
+        <w:br/>
+        <w:t>• Character: The borrower’s reputational standing, integrity, and historical willingness to honor debt obligations.</w:t>
+        <w:br/>
+        <w:t>• Capacity: The financial ability to service principal and interest obligations from operating cash flows, historically evaluated through crude debt-servicing ratios.</w:t>
+        <w:br/>
+        <w:t>• Capital: The borrower's equity stake, net worth, and financial resilience to absorb unexpected business losses.</w:t>
+        <w:br/>
+        <w:t>• Collateral: The physical or financial assets pledged as secondary repayment security in the event of liquidation.</w:t>
+        <w:br/>
+        <w:t>• Conditions: The macroeconomic, regulatory, and sector-specific business climate affecting the borrower's operating margins.</w:t>
+        <w:br/>
+        <w:t>While holistic, the 5 Cs paradigm suffered from severe human subjectivity, cognitive bias, susceptibility to regional manager inconsistencies, and an inability to process high-dimensional quantitative data at scale.</w:t>
+        <w:br/>
+        <w:br/>
+        <w:t>2. Generation 2: Parametric Statistical Scoring &amp; Bureau Rating Models:</w:t>
+        <w:br/>
+        <w:t>In the late 1960s, statistical credit scoring emerged with Edward I. Altman’s (1968) Z-Score model, which pioneered Multivariate Discriminant Analysis (MDA) to forecast corporate bankruptcy. This was subsequently augmented by Logistic Regression (Logit) and Probit scoring algorithms in the 1980s, enabling commercial banks to compute empirical default odds for retail applicants. In India, this era culminated in the establishment of formal credit reference agencies—principally the Credit Information Bureau (India) Limited (CIBIL) in 2000—which standardized consumer credit scoring across a three-digit numerical spectrum (300 to 900). However, bureau scores remain fundamentally backward-looking, reflecting past repayment history while remaining blind to real-time cash flow shocks, macroeconomic stress, or accounting anomalies.</w:t>
+        <w:br/>
+        <w:br/>
+        <w:t>3. Generation 3: Monolithic Machine Learning Classifiers:</w:t>
+        <w:br/>
+        <w:t>With the proliferation of digital financial data, banks integrated supervised machine learning models—such as Support Vector Machines (SVM), Random Forests, and Gradient Boosting Decision Trees (XGBoost). These models effectively captured complex non-linear feature interactions and high-order correlations. However, early Generation 3 systems operated as unconstrained 'black boxes' lacking regulatory explainability (XAI), struggled to digest unstructured balance sheets, and frequently produced statistical predictions disconnected from official RBI Master Directions and statutory risk grades.</w:t>
+        <w:br/>
+        <w:br/>
+        <w:t>4. Generation 4: Autonomous Multi-Agent AI &amp; Deterministic Graph Workflows:</w:t>
+        <w:br/>
+        <w:t>The current frontier—embodied by the Intelligent Loan Appraisal System (ILAS)—unifies deterministic algorithmic financial engines, supervised machine learning risk classifiers, domain-specific Retrieval-Augmented Generation (RAG), and stateful multi-agent orchestration. By assigning specialized autonomous agents to isolated underwriting functions (PII masking, document parsing, ratio computation, ML risk forecasting, and regulatory cross-referencing), Generation 4 systems achieve complete mathematical determinism, regulatory explainability, and ultra-low latency.</w:t>
+      </w:r>
+    </w:p>
+    <w:p>
+      <w:pPr>
+        <w:spacing w:after="200"/>
+      </w:pPr>
+      <w:r>
+        <w:rPr>
+          <w:rFonts w:ascii="Calibri" w:hAnsi="Calibri"/>
+          <w:b/>
+          <w:color w:val="003366"/>
+          <w:sz w:val="26"/>
+        </w:rPr>
+        <w:t>2.2 Reserve Bank of India (RBI) Prudential Underwriting Directives</w:t>
+        <w:br/>
+      </w:r>
+      <w:r>
+        <w:rPr>
+          <w:rFonts w:ascii="Calibri" w:hAnsi="Calibri"/>
+          <w:color w:val="1E293B"/>
+          <w:sz w:val="22"/>
+        </w:rPr>
+        <w:t>As the central banking authority of India, the Reserve Bank of India (RBI) establishes mandatory prudential norms governing retail credit exposures, commercial advances, risk-weighted capital adequacy, and priority sector mandates. Any institutional underwriting system must enforce these statutory boundaries as inviolable mathematical constraints.</w:t>
+        <w:br/>
+        <w:br/>
+        <w:t>1. Loan-to-Value (LTV) Ratios and Risk Weights for Individual Housing Loans:</w:t>
+        <w:br/>
+        <w:t>Pursuant to RBI Master Directions on Housing Finance (RBI/2020-21/73 DOR.No.BP.BC.24/08.12.015/2020-21), commercial banks are legally prohibited from granting loans against real estate that breach statutory Loan-to-Value (LTV) ceilings. Furthermore, regulatory risk weights assigned to housing exposures are directly linked to the loan quantum and LTV threshold:</w:t>
+      </w:r>
+    </w:p>
+    <w:p>
+      <w:r>
+        <w:rPr>
+          <w:rFonts w:ascii="Calibri" w:hAnsi="Calibri"/>
+          <w:b/>
+          <w:color w:val="003366"/>
+          <w:sz w:val="21"/>
+        </w:rPr>
+        <w:t>Table 2.1: Reserve Bank of India (RBI) Statutory LTV and Risk Weight Norms</w:t>
+      </w:r>
+    </w:p>
+    <w:tbl>
+      <w:tblPr>
+        <w:tblW w:type="auto" w:w="0"/>
+        <w:jc w:val="center"/>
+        <w:tblLook w:firstColumn="1" w:firstRow="1" w:lastColumn="0" w:lastRow="0" w:noHBand="0" w:noVBand="1" w:val="04A0"/>
+      </w:tblPr>
+      <w:tblGrid>
+        <w:gridCol w:w="1872"/>
+        <w:gridCol w:w="1872"/>
+        <w:gridCol w:w="1872"/>
+        <w:gridCol w:w="1872"/>
+        <w:gridCol w:w="1872"/>
+      </w:tblGrid>
+      <w:tr>
+        <w:tc>
+          <w:tcPr>
+            <w:tcW w:type="dxa" w:w="2592"/>
+            <w:shd w:fill="003366"/>
+            <w:tcMar>
+              <w:top w:w="60" w:type="dxa"/>
+              <w:bottom w:w="60" w:type="dxa"/>
+              <w:left w:w="60" w:type="dxa"/>
+              <w:right w:w="60" w:type="dxa"/>
+            </w:tcMar>
+          </w:tcPr>
+          <w:p>
+            <w:r>
+              <w:rPr>
+                <w:rFonts w:ascii="Calibri" w:hAnsi="Calibri"/>
+                <w:b/>
+                <w:color w:val="FFFFFF"/>
+                <w:sz w:val="18"/>
+              </w:rPr>
+              <w:t>LOAN SLAB</w:t>
+            </w:r>
+          </w:p>
+        </w:tc>
+        <w:tc>
+          <w:tcPr>
+            <w:tcW w:type="dxa" w:w="1440"/>
+            <w:shd w:fill="003366"/>
+            <w:tcMar>
+              <w:top w:w="60" w:type="dxa"/>
+              <w:bottom w:w="60" w:type="dxa"/>
+              <w:left w:w="60" w:type="dxa"/>
+              <w:right w:w="60" w:type="dxa"/>
+            </w:tcMar>
+          </w:tcPr>
+          <w:p>
+            <w:r>
+              <w:rPr>
+                <w:rFonts w:ascii="Calibri" w:hAnsi="Calibri"/>
+                <w:b/>
+                <w:color w:val="FFFFFF"/>
+                <w:sz w:val="18"/>
+              </w:rPr>
+              <w:t>LTV CEILING</w:t>
+            </w:r>
+          </w:p>
+        </w:tc>
+        <w:tc>
+          <w:tcPr>
+            <w:tcW w:type="dxa" w:w="1440"/>
+            <w:shd w:fill="003366"/>
+            <w:tcMar>
+              <w:top w:w="60" w:type="dxa"/>
+              <w:bottom w:w="60" w:type="dxa"/>
+              <w:left w:w="60" w:type="dxa"/>
+              <w:right w:w="60" w:type="dxa"/>
+            </w:tcMar>
+          </w:tcPr>
+          <w:p>
+            <w:r>
+              <w:rPr>
+                <w:rFonts w:ascii="Calibri" w:hAnsi="Calibri"/>
+                <w:b/>
+                <w:color w:val="FFFFFF"/>
+                <w:sz w:val="18"/>
+              </w:rPr>
+              <w:t>RISK WEIGHT</w:t>
+            </w:r>
+          </w:p>
+        </w:tc>
+        <w:tc>
+          <w:tcPr>
+            <w:tcW w:type="dxa" w:w="1440"/>
+            <w:shd w:fill="003366"/>
+            <w:tcMar>
+              <w:top w:w="60" w:type="dxa"/>
+              <w:bottom w:w="60" w:type="dxa"/>
+              <w:left w:w="60" w:type="dxa"/>
+              <w:right w:w="60" w:type="dxa"/>
+            </w:tcMar>
+          </w:tcPr>
+          <w:p>
+            <w:r>
+              <w:rPr>
+                <w:rFonts w:ascii="Calibri" w:hAnsi="Calibri"/>
+                <w:b/>
+                <w:color w:val="FFFFFF"/>
+                <w:sz w:val="18"/>
+              </w:rPr>
+              <w:t>MIN MARGIN</w:t>
+            </w:r>
+          </w:p>
+        </w:tc>
+        <w:tc>
+          <w:tcPr>
+            <w:tcW w:type="dxa" w:w="2448"/>
+            <w:shd w:fill="003366"/>
+            <w:tcMar>
+              <w:top w:w="60" w:type="dxa"/>
+              <w:bottom w:w="60" w:type="dxa"/>
+              <w:left w:w="60" w:type="dxa"/>
+              <w:right w:w="60" w:type="dxa"/>
+            </w:tcMar>
+          </w:tcPr>
+          <w:p>
+            <w:r>
+              <w:rPr>
+                <w:rFonts w:ascii="Calibri" w:hAnsi="Calibri"/>
+                <w:b/>
+                <w:color w:val="FFFFFF"/>
+                <w:sz w:val="18"/>
+              </w:rPr>
+              <w:t>REGULATORY PURPOSE</w:t>
+            </w:r>
+          </w:p>
+        </w:tc>
+      </w:tr>
+      <w:tr>
+        <w:tc>
+          <w:tcPr>
+            <w:tcW w:type="dxa" w:w="2592"/>
+            <w:shd w:fill="F8FAFC"/>
+            <w:tcMar>
+              <w:top w:w="40" w:type="dxa"/>
+              <w:bottom w:w="40" w:type="dxa"/>
+              <w:left w:w="50" w:type="dxa"/>
+              <w:right w:w="50" w:type="dxa"/>
+            </w:tcMar>
+          </w:tcPr>
+          <w:p>
+            <w:r>
+              <w:rPr>
+                <w:rFonts w:ascii="Calibri" w:hAnsi="Calibri"/>
+                <w:b/>
+                <w:color w:val="003366"/>
+                <w:sz w:val="17"/>
+              </w:rPr>
+              <w:t>Individual Loans &lt;= ₹30 Lakhs</w:t>
+            </w:r>
+          </w:p>
+        </w:tc>
+        <w:tc>
+          <w:tcPr>
+            <w:tcW w:type="dxa" w:w="1440"/>
+            <w:shd w:fill="F8FAFC"/>
+            <w:tcMar>
+              <w:top w:w="40" w:type="dxa"/>
+              <w:bottom w:w="40" w:type="dxa"/>
+              <w:left w:w="50" w:type="dxa"/>
+              <w:right w:w="50" w:type="dxa"/>
+            </w:tcMar>
+          </w:tcPr>
+          <w:p>
+            <w:r>
+              <w:rPr>
+                <w:rFonts w:ascii="Calibri" w:hAnsi="Calibri"/>
+                <w:b w:val="0"/>
+                <w:color w:val="1E293B"/>
+                <w:sz w:val="17"/>
+              </w:rPr>
+              <w:t>90.0%</w:t>
+            </w:r>
+          </w:p>
+        </w:tc>
+        <w:tc>
+          <w:tcPr>
+            <w:tcW w:type="dxa" w:w="1440"/>
+            <w:shd w:fill="F8FAFC"/>
+            <w:tcMar>
+              <w:top w:w="40" w:type="dxa"/>
+              <w:bottom w:w="40" w:type="dxa"/>
+              <w:left w:w="50" w:type="dxa"/>
+              <w:right w:w="50" w:type="dxa"/>
+            </w:tcMar>
+          </w:tcPr>
+          <w:p>
+            <w:r>
+              <w:rPr>
+                <w:rFonts w:ascii="Calibri" w:hAnsi="Calibri"/>
+                <w:b w:val="0"/>
+                <w:color w:val="1E293B"/>
+                <w:sz w:val="17"/>
+              </w:rPr>
+              <w:t>35.0%</w:t>
+            </w:r>
+          </w:p>
+        </w:tc>
+        <w:tc>
+          <w:tcPr>
+            <w:tcW w:type="dxa" w:w="1440"/>
+            <w:shd w:fill="F8FAFC"/>
+            <w:tcMar>
+              <w:top w:w="40" w:type="dxa"/>
+              <w:bottom w:w="40" w:type="dxa"/>
+              <w:left w:w="50" w:type="dxa"/>
+              <w:right w:w="50" w:type="dxa"/>
+            </w:tcMar>
+          </w:tcPr>
+          <w:p>
+            <w:r>
+              <w:rPr>
+                <w:rFonts w:ascii="Calibri" w:hAnsi="Calibri"/>
+                <w:b w:val="0"/>
+                <w:color w:val="1E293B"/>
+                <w:sz w:val="17"/>
+              </w:rPr>
+              <w:t>10.0%</w:t>
+            </w:r>
+          </w:p>
+        </w:tc>
+        <w:tc>
+          <w:tcPr>
+            <w:tcW w:type="dxa" w:w="2448"/>
+            <w:shd w:fill="F8FAFC"/>
+            <w:tcMar>
+              <w:top w:w="40" w:type="dxa"/>
+              <w:bottom w:w="40" w:type="dxa"/>
+              <w:left w:w="50" w:type="dxa"/>
+              <w:right w:w="50" w:type="dxa"/>
+            </w:tcMar>
+          </w:tcPr>
+          <w:p>
+            <w:r>
+              <w:rPr>
+                <w:rFonts w:ascii="Calibri" w:hAnsi="Calibri"/>
+                <w:b w:val="0"/>
+                <w:color w:val="1E293B"/>
+                <w:sz w:val="17"/>
+              </w:rPr>
+              <w:t>Affordable Housing Support; Low Systemic Risk Weighting.</w:t>
+            </w:r>
+          </w:p>
+        </w:tc>
+      </w:tr>
+      <w:tr>
+        <w:tc>
+          <w:tcPr>
+            <w:tcW w:type="dxa" w:w="2592"/>
+            <w:shd w:fill="FFFFFF"/>
+            <w:tcMar>
+              <w:top w:w="40" w:type="dxa"/>
+              <w:bottom w:w="40" w:type="dxa"/>
+              <w:left w:w="50" w:type="dxa"/>
+              <w:right w:w="50" w:type="dxa"/>
+            </w:tcMar>
+          </w:tcPr>
+          <w:p>
+            <w:r>
+              <w:rPr>
+                <w:rFonts w:ascii="Calibri" w:hAnsi="Calibri"/>
+                <w:b/>
+                <w:color w:val="003366"/>
+                <w:sz w:val="17"/>
+              </w:rPr>
+              <w:t>Individual Loans &gt; ₹30L &lt;= ₹75L</w:t>
+            </w:r>
+          </w:p>
+        </w:tc>
+        <w:tc>
+          <w:tcPr>
+            <w:tcW w:type="dxa" w:w="1440"/>
+            <w:shd w:fill="FFFFFF"/>
+            <w:tcMar>
+              <w:top w:w="40" w:type="dxa"/>
+              <w:bottom w:w="40" w:type="dxa"/>
+              <w:left w:w="50" w:type="dxa"/>
+              <w:right w:w="50" w:type="dxa"/>
+            </w:tcMar>
+          </w:tcPr>
+          <w:p>
+            <w:r>
+              <w:rPr>
+                <w:rFonts w:ascii="Calibri" w:hAnsi="Calibri"/>
+                <w:b w:val="0"/>
+                <w:color w:val="1E293B"/>
+                <w:sz w:val="17"/>
+              </w:rPr>
+              <w:t>80.0%</w:t>
+            </w:r>
+          </w:p>
+        </w:tc>
+        <w:tc>
+          <w:tcPr>
+            <w:tcW w:type="dxa" w:w="1440"/>
+            <w:shd w:fill="FFFFFF"/>
+            <w:tcMar>
+              <w:top w:w="40" w:type="dxa"/>
+              <w:bottom w:w="40" w:type="dxa"/>
+              <w:left w:w="50" w:type="dxa"/>
+              <w:right w:w="50" w:type="dxa"/>
+            </w:tcMar>
+          </w:tcPr>
+          <w:p>
+            <w:r>
+              <w:rPr>
+                <w:rFonts w:ascii="Calibri" w:hAnsi="Calibri"/>
+                <w:b w:val="0"/>
+                <w:color w:val="1E293B"/>
+                <w:sz w:val="17"/>
+              </w:rPr>
+              <w:t>35.0%</w:t>
+            </w:r>
+          </w:p>
+        </w:tc>
+        <w:tc>
+          <w:tcPr>
+            <w:tcW w:type="dxa" w:w="1440"/>
+            <w:shd w:fill="FFFFFF"/>
+            <w:tcMar>
+              <w:top w:w="40" w:type="dxa"/>
+              <w:bottom w:w="40" w:type="dxa"/>
+              <w:left w:w="50" w:type="dxa"/>
+              <w:right w:w="50" w:type="dxa"/>
+            </w:tcMar>
+          </w:tcPr>
+          <w:p>
+            <w:r>
+              <w:rPr>
+                <w:rFonts w:ascii="Calibri" w:hAnsi="Calibri"/>
+                <w:b w:val="0"/>
+                <w:color w:val="1E293B"/>
+                <w:sz w:val="17"/>
+              </w:rPr>
+              <w:t>20.0%</w:t>
+            </w:r>
+          </w:p>
+        </w:tc>
+        <w:tc>
+          <w:tcPr>
+            <w:tcW w:type="dxa" w:w="2448"/>
+            <w:shd w:fill="FFFFFF"/>
+            <w:tcMar>
+              <w:top w:w="40" w:type="dxa"/>
+              <w:bottom w:w="40" w:type="dxa"/>
+              <w:left w:w="50" w:type="dxa"/>
+              <w:right w:w="50" w:type="dxa"/>
+            </w:tcMar>
+          </w:tcPr>
+          <w:p>
+            <w:r>
+              <w:rPr>
+                <w:rFonts w:ascii="Calibri" w:hAnsi="Calibri"/>
+                <w:b w:val="0"/>
+                <w:color w:val="1E293B"/>
+                <w:sz w:val="17"/>
+              </w:rPr>
+              <w:t>Mid-Segment Housing; Standard Prudential Capital Buffer.</w:t>
+            </w:r>
+          </w:p>
+        </w:tc>
+      </w:tr>
+      <w:tr>
+        <w:tc>
+          <w:tcPr>
+            <w:tcW w:type="dxa" w:w="2592"/>
+            <w:shd w:fill="F8FAFC"/>
+            <w:tcMar>
+              <w:top w:w="40" w:type="dxa"/>
+              <w:bottom w:w="40" w:type="dxa"/>
+              <w:left w:w="50" w:type="dxa"/>
+              <w:right w:w="50" w:type="dxa"/>
+            </w:tcMar>
+          </w:tcPr>
+          <w:p>
+            <w:r>
+              <w:rPr>
+                <w:rFonts w:ascii="Calibri" w:hAnsi="Calibri"/>
+                <w:b/>
+                <w:color w:val="003366"/>
+                <w:sz w:val="17"/>
+              </w:rPr>
+              <w:t>Individual Loans &gt; ₹75 Lakhs</w:t>
+            </w:r>
+          </w:p>
+        </w:tc>
+        <w:tc>
+          <w:tcPr>
+            <w:tcW w:type="dxa" w:w="1440"/>
+            <w:shd w:fill="F8FAFC"/>
+            <w:tcMar>
+              <w:top w:w="40" w:type="dxa"/>
+              <w:bottom w:w="40" w:type="dxa"/>
+              <w:left w:w="50" w:type="dxa"/>
+              <w:right w:w="50" w:type="dxa"/>
+            </w:tcMar>
+          </w:tcPr>
+          <w:p>
+            <w:r>
+              <w:rPr>
+                <w:rFonts w:ascii="Calibri" w:hAnsi="Calibri"/>
+                <w:b w:val="0"/>
+                <w:color w:val="1E293B"/>
+                <w:sz w:val="17"/>
+              </w:rPr>
+              <w:t>75.0%</w:t>
+            </w:r>
+          </w:p>
+        </w:tc>
+        <w:tc>
+          <w:tcPr>
+            <w:tcW w:type="dxa" w:w="1440"/>
+            <w:shd w:fill="F8FAFC"/>
+            <w:tcMar>
+              <w:top w:w="40" w:type="dxa"/>
+              <w:bottom w:w="40" w:type="dxa"/>
+              <w:left w:w="50" w:type="dxa"/>
+              <w:right w:w="50" w:type="dxa"/>
+            </w:tcMar>
+          </w:tcPr>
+          <w:p>
+            <w:r>
+              <w:rPr>
+                <w:rFonts w:ascii="Calibri" w:hAnsi="Calibri"/>
+                <w:b w:val="0"/>
+                <w:color w:val="1E293B"/>
+                <w:sz w:val="17"/>
+              </w:rPr>
+              <w:t>50.0%</w:t>
+            </w:r>
+          </w:p>
+        </w:tc>
+        <w:tc>
+          <w:tcPr>
+            <w:tcW w:type="dxa" w:w="1440"/>
+            <w:shd w:fill="F8FAFC"/>
+            <w:tcMar>
+              <w:top w:w="40" w:type="dxa"/>
+              <w:bottom w:w="40" w:type="dxa"/>
+              <w:left w:w="50" w:type="dxa"/>
+              <w:right w:w="50" w:type="dxa"/>
+            </w:tcMar>
+          </w:tcPr>
+          <w:p>
+            <w:r>
+              <w:rPr>
+                <w:rFonts w:ascii="Calibri" w:hAnsi="Calibri"/>
+                <w:b w:val="0"/>
+                <w:color w:val="1E293B"/>
+                <w:sz w:val="17"/>
+              </w:rPr>
+              <w:t>25.0%</w:t>
+            </w:r>
+          </w:p>
+        </w:tc>
+        <w:tc>
+          <w:tcPr>
+            <w:tcW w:type="dxa" w:w="2448"/>
+            <w:shd w:fill="F8FAFC"/>
+            <w:tcMar>
+              <w:top w:w="40" w:type="dxa"/>
+              <w:bottom w:w="40" w:type="dxa"/>
+              <w:left w:w="50" w:type="dxa"/>
+              <w:right w:w="50" w:type="dxa"/>
+            </w:tcMar>
+          </w:tcPr>
+          <w:p>
+            <w:r>
+              <w:rPr>
+                <w:rFonts w:ascii="Calibri" w:hAnsi="Calibri"/>
+                <w:b w:val="0"/>
+                <w:color w:val="1E293B"/>
+                <w:sz w:val="17"/>
+              </w:rPr>
+              <w:t>Premium Real Estate; Higher Capital Risk Weighting.</w:t>
+            </w:r>
+          </w:p>
+        </w:tc>
+      </w:tr>
+      <w:tr>
+        <w:tc>
+          <w:tcPr>
+            <w:tcW w:type="dxa" w:w="2592"/>
+            <w:shd w:fill="FFFFFF"/>
+            <w:tcMar>
+              <w:top w:w="40" w:type="dxa"/>
+              <w:bottom w:w="40" w:type="dxa"/>
+              <w:left w:w="50" w:type="dxa"/>
+              <w:right w:w="50" w:type="dxa"/>
+            </w:tcMar>
+          </w:tcPr>
+          <w:p>
+            <w:r>
+              <w:rPr>
+                <w:rFonts w:ascii="Calibri" w:hAnsi="Calibri"/>
+                <w:b/>
+                <w:color w:val="003366"/>
+                <w:sz w:val="17"/>
+              </w:rPr>
+              <w:t>Commercial Real Estate (CRE)</w:t>
+            </w:r>
+          </w:p>
+        </w:tc>
+        <w:tc>
+          <w:tcPr>
+            <w:tcW w:type="dxa" w:w="1440"/>
+            <w:shd w:fill="FFFFFF"/>
+            <w:tcMar>
+              <w:top w:w="40" w:type="dxa"/>
+              <w:bottom w:w="40" w:type="dxa"/>
+              <w:left w:w="50" w:type="dxa"/>
+              <w:right w:w="50" w:type="dxa"/>
+            </w:tcMar>
+          </w:tcPr>
+          <w:p>
+            <w:r>
+              <w:rPr>
+                <w:rFonts w:ascii="Calibri" w:hAnsi="Calibri"/>
+                <w:b w:val="0"/>
+                <w:color w:val="1E293B"/>
+                <w:sz w:val="17"/>
+              </w:rPr>
+              <w:t>60.0%</w:t>
+            </w:r>
+          </w:p>
+        </w:tc>
+        <w:tc>
+          <w:tcPr>
+            <w:tcW w:type="dxa" w:w="1440"/>
+            <w:shd w:fill="FFFFFF"/>
+            <w:tcMar>
+              <w:top w:w="40" w:type="dxa"/>
+              <w:bottom w:w="40" w:type="dxa"/>
+              <w:left w:w="50" w:type="dxa"/>
+              <w:right w:w="50" w:type="dxa"/>
+            </w:tcMar>
+          </w:tcPr>
+          <w:p>
+            <w:r>
+              <w:rPr>
+                <w:rFonts w:ascii="Calibri" w:hAnsi="Calibri"/>
+                <w:b w:val="0"/>
+                <w:color w:val="1E293B"/>
+                <w:sz w:val="17"/>
+              </w:rPr>
+              <w:t>100.0%</w:t>
+            </w:r>
+          </w:p>
+        </w:tc>
+        <w:tc>
+          <w:tcPr>
+            <w:tcW w:type="dxa" w:w="1440"/>
+            <w:shd w:fill="FFFFFF"/>
+            <w:tcMar>
+              <w:top w:w="40" w:type="dxa"/>
+              <w:bottom w:w="40" w:type="dxa"/>
+              <w:left w:w="50" w:type="dxa"/>
+              <w:right w:w="50" w:type="dxa"/>
+            </w:tcMar>
+          </w:tcPr>
+          <w:p>
+            <w:r>
+              <w:rPr>
+                <w:rFonts w:ascii="Calibri" w:hAnsi="Calibri"/>
+                <w:b w:val="0"/>
+                <w:color w:val="1E293B"/>
+                <w:sz w:val="17"/>
+              </w:rPr>
+              <w:t>40.0%</w:t>
+            </w:r>
+          </w:p>
+        </w:tc>
+        <w:tc>
+          <w:tcPr>
+            <w:tcW w:type="dxa" w:w="2448"/>
+            <w:shd w:fill="FFFFFF"/>
+            <w:tcMar>
+              <w:top w:w="40" w:type="dxa"/>
+              <w:bottom w:w="40" w:type="dxa"/>
+              <w:left w:w="50" w:type="dxa"/>
+              <w:right w:w="50" w:type="dxa"/>
+            </w:tcMar>
+          </w:tcPr>
+          <w:p>
+            <w:r>
+              <w:rPr>
+                <w:rFonts w:ascii="Calibri" w:hAnsi="Calibri"/>
+                <w:b w:val="0"/>
+                <w:color w:val="1E293B"/>
+                <w:sz w:val="17"/>
+              </w:rPr>
+              <w:t>Speculative Asset Protection; Strict Capital Conservation.</w:t>
+            </w:r>
+          </w:p>
+        </w:tc>
+      </w:tr>
+    </w:tbl>
+    <w:p>
+      <w:pPr>
+        <w:spacing w:after="320"/>
+      </w:pPr>
+      <w:r>
+        <w:rPr>
+          <w:rFonts w:ascii="Calibri" w:hAnsi="Calibri"/>
+          <w:color w:val="1E293B"/>
+          <w:sz w:val="22"/>
+        </w:rPr>
+        <w:br/>
+        <w:t>2. Fixed Obligation to Income Ratio (FOIR) Norms:</w:t>
+        <w:br/>
+        <w:t>While LTV measures asset cover, the Fixed Obligation to Income Ratio (FOIR) evaluates the borrower's debt-serviceability and net cash flow capacity. RBI guidelines mandate that aggregate monthly debt obligations (including the proposed EMI, existing personal loans, vehicle loans, and credit card minimum payments) must not exhaust the borrower’s disposable income:</w:t>
+        <w:br/>
+        <w:t>FOIR = [(Proposed Loan EMI + Sum of Existing Monthly Obligations) / Gross Monthly Income] * 100</w:t>
+        <w:br/>
+        <w:t>• Standard Prudential Ceiling: FOIR &lt;= 50.0%.</w:t>
+        <w:br/>
+        <w:t>• High-Income Salaried Concession: For borrowers with gross monthly income exceeding ₹1,50,000, credit policies permit a maximum FOIR of up to 60.0%, provided Net Take-Home Pay satisfies minimum subsistence thresholds.</w:t>
+        <w:br/>
+        <w:br/>
+        <w:t>3. Priority Sector Lending (PSL) &amp; MSME Credit Mandates:</w:t>
+        <w:br/>
+        <w:t>Under RBI Priority Sector Lending norms (FIDD.CO.Plan.BC.5/04.09.01/2020-21), Scheduled Commercial Banks must allocate at least 40% of Adjusted Net Bank Credit (ANBC) or Credit Equivalent of Off-Balance Sheet Exposure (CEOBE) to priority sectors. Specifically, at least 7.5% of ANBC must be disbursed to micro-enterprises. Under the Credit Guarantee Fund Trust for Micro and Small Enterprises (CGTMSE), loans up to ₹5.00 Crores granted without third-party collateral or personal guarantees are eligible for guarantee cover ranging between 75% and 85%.</w:t>
+      </w:r>
+    </w:p>
+    <w:p>
+      <w:pPr>
+        <w:spacing w:after="200"/>
+      </w:pPr>
+      <w:r>
+        <w:rPr>
+          <w:rFonts w:ascii="Calibri" w:hAnsi="Calibri"/>
+          <w:b/>
+          <w:color w:val="003366"/>
+          <w:sz w:val="26"/>
+        </w:rPr>
+        <w:t>2.3 Basel II and Basel III Accords: Internal Ratings-Based (IRB) Approaches</w:t>
+        <w:br/>
+      </w:r>
+      <w:r>
+        <w:rPr>
+          <w:rFonts w:ascii="Calibri" w:hAnsi="Calibri"/>
+          <w:color w:val="1E293B"/>
+          <w:sz w:val="22"/>
+        </w:rPr>
+        <w:t>The Basel Committee on Banking Supervision (BCBS) establishes international capital standards designed to ensure commercial banks maintain adequate capital buffers against credit, market, and operational risks. Under Basel II and Basel III frameworks adopted by the Reserve Bank of India, commercial banks evaluate credit risk via the Standardized Approach (SA) or the Internal Ratings-Based (IRB) Approach.</w:t>
+        <w:br/>
+        <w:br/>
+        <w:t>Under Advanced IRB (A-IRB) paradigms, the Expected Loss (EL) and regulatory capital requirements of a loan asset are calculated as a function of four structural risk drivers:</w:t>
+        <w:br/>
+        <w:t>EL = PD * LGD * EAD</w:t>
+        <w:br/>
+        <w:t>• Probability of Default (PD): The empirical likelihood (%) that a borrower will default over a 12-to-24 month horizon. In ILAS, PD is estimated via an optimized XGBoost classification model and mapped to the Basel 5-Tier Default Scale.</w:t>
+        <w:br/>
+        <w:t>• Loss Given Default (LGD): The percentage of exposure lost if default occurs, determined by collateral value and recovery costs: LGD = 1 - (Discounted Recoverable Collateral Value / EAD).</w:t>
+        <w:br/>
+        <w:t>• Exposure at Default (EAD): The gross nominal exposure outstanding at the time of default: EAD = Drawn Balance + (Undrawn Credit Limit * CCF).</w:t>
+      </w:r>
+    </w:p>
+    <w:p>
+      <w:r>
+        <w:rPr>
+          <w:rFonts w:ascii="Calibri" w:hAnsi="Calibri"/>
+          <w:b/>
+          <w:color w:val="003366"/>
+          <w:sz w:val="21"/>
+        </w:rPr>
+        <w:t>Table 2.2: Basel III Capital Adequacy Risk Weights for Retail &amp; MSME Asset Classes</w:t>
+      </w:r>
+    </w:p>
+    <w:tbl>
+      <w:tblPr>
+        <w:tblW w:type="auto" w:w="0"/>
+        <w:jc w:val="center"/>
+        <w:tblLook w:firstColumn="1" w:firstRow="1" w:lastColumn="0" w:lastRow="0" w:noHBand="0" w:noVBand="1" w:val="04A0"/>
+      </w:tblPr>
+      <w:tblGrid>
+        <w:gridCol w:w="2340"/>
+        <w:gridCol w:w="2340"/>
+        <w:gridCol w:w="2340"/>
+        <w:gridCol w:w="2340"/>
+      </w:tblGrid>
+      <w:tr>
+        <w:tc>
+          <w:tcPr>
+            <w:tcW w:type="dxa" w:w="2592"/>
+            <w:shd w:fill="003366"/>
+            <w:tcMar>
+              <w:top w:w="60" w:type="dxa"/>
+              <w:bottom w:w="60" w:type="dxa"/>
+              <w:left w:w="60" w:type="dxa"/>
+              <w:right w:w="60" w:type="dxa"/>
+            </w:tcMar>
+          </w:tcPr>
+          <w:p>
+            <w:r>
+              <w:rPr>
+                <w:rFonts w:ascii="Calibri" w:hAnsi="Calibri"/>
+                <w:b/>
+                <w:color w:val="FFFFFF"/>
+                <w:sz w:val="18"/>
+              </w:rPr>
+              <w:t>ASSET CATEGORY</w:t>
+            </w:r>
+          </w:p>
+        </w:tc>
+        <w:tc>
+          <w:tcPr>
+            <w:tcW w:type="dxa" w:w="3312"/>
+            <w:shd w:fill="003366"/>
+            <w:tcMar>
+              <w:top w:w="60" w:type="dxa"/>
+              <w:bottom w:w="60" w:type="dxa"/>
+              <w:left w:w="60" w:type="dxa"/>
+              <w:right w:w="60" w:type="dxa"/>
+            </w:tcMar>
+          </w:tcPr>
+          <w:p>
+            <w:r>
+              <w:rPr>
+                <w:rFonts w:ascii="Calibri" w:hAnsi="Calibri"/>
+                <w:b/>
+                <w:color w:val="FFFFFF"/>
+                <w:sz w:val="18"/>
+              </w:rPr>
+              <w:t>FACILITY DESCRIPTION</w:t>
+            </w:r>
+          </w:p>
+        </w:tc>
+        <w:tc>
+          <w:tcPr>
+            <w:tcW w:type="dxa" w:w="1440"/>
+            <w:shd w:fill="003366"/>
+            <w:tcMar>
+              <w:top w:w="60" w:type="dxa"/>
+              <w:bottom w:w="60" w:type="dxa"/>
+              <w:left w:w="60" w:type="dxa"/>
+              <w:right w:w="60" w:type="dxa"/>
+            </w:tcMar>
+          </w:tcPr>
+          <w:p>
+            <w:r>
+              <w:rPr>
+                <w:rFonts w:ascii="Calibri" w:hAnsi="Calibri"/>
+                <w:b/>
+                <w:color w:val="FFFFFF"/>
+                <w:sz w:val="18"/>
+              </w:rPr>
+              <w:t>RISK WEIGHT</w:t>
+            </w:r>
+          </w:p>
+        </w:tc>
+        <w:tc>
+          <w:tcPr>
+            <w:tcW w:type="dxa" w:w="2016"/>
+            <w:shd w:fill="003366"/>
+            <w:tcMar>
+              <w:top w:w="60" w:type="dxa"/>
+              <w:bottom w:w="60" w:type="dxa"/>
+              <w:left w:w="60" w:type="dxa"/>
+              <w:right w:w="60" w:type="dxa"/>
+            </w:tcMar>
+          </w:tcPr>
+          <w:p>
+            <w:r>
+              <w:rPr>
+                <w:rFonts w:ascii="Calibri" w:hAnsi="Calibri"/>
+                <w:b/>
+                <w:color w:val="FFFFFF"/>
+                <w:sz w:val="18"/>
+              </w:rPr>
+              <w:t>CAPITAL CHARGE (11.5% CRAR)</w:t>
+            </w:r>
+          </w:p>
+        </w:tc>
+      </w:tr>
+      <w:tr>
+        <w:tc>
+          <w:tcPr>
+            <w:tcW w:type="dxa" w:w="2592"/>
+            <w:shd w:fill="F8FAFC"/>
+            <w:tcMar>
+              <w:top w:w="40" w:type="dxa"/>
+              <w:bottom w:w="40" w:type="dxa"/>
+              <w:left w:w="50" w:type="dxa"/>
+              <w:right w:w="50" w:type="dxa"/>
+            </w:tcMar>
+          </w:tcPr>
+          <w:p>
+            <w:r>
+              <w:rPr>
+                <w:rFonts w:ascii="Calibri" w:hAnsi="Calibri"/>
+                <w:b/>
+                <w:color w:val="003366"/>
+                <w:sz w:val="17"/>
+              </w:rPr>
+              <w:t>Retail: Low-Risk Housing</w:t>
+            </w:r>
+          </w:p>
+        </w:tc>
+        <w:tc>
+          <w:tcPr>
+            <w:tcW w:type="dxa" w:w="3312"/>
+            <w:shd w:fill="F8FAFC"/>
+            <w:tcMar>
+              <w:top w:w="40" w:type="dxa"/>
+              <w:bottom w:w="40" w:type="dxa"/>
+              <w:left w:w="50" w:type="dxa"/>
+              <w:right w:w="50" w:type="dxa"/>
+            </w:tcMar>
+          </w:tcPr>
+          <w:p>
+            <w:r>
+              <w:rPr>
+                <w:rFonts w:ascii="Calibri" w:hAnsi="Calibri"/>
+                <w:b w:val="0"/>
+                <w:color w:val="1E293B"/>
+                <w:sz w:val="17"/>
+              </w:rPr>
+              <w:t>Housing Loans &lt;= ₹30L with LTV &lt;= 80%</w:t>
+            </w:r>
+          </w:p>
+        </w:tc>
+        <w:tc>
+          <w:tcPr>
+            <w:tcW w:type="dxa" w:w="1440"/>
+            <w:shd w:fill="F8FAFC"/>
+            <w:tcMar>
+              <w:top w:w="40" w:type="dxa"/>
+              <w:bottom w:w="40" w:type="dxa"/>
+              <w:left w:w="50" w:type="dxa"/>
+              <w:right w:w="50" w:type="dxa"/>
+            </w:tcMar>
+          </w:tcPr>
+          <w:p>
+            <w:r>
+              <w:rPr>
+                <w:rFonts w:ascii="Calibri" w:hAnsi="Calibri"/>
+                <w:b w:val="0"/>
+                <w:color w:val="1E293B"/>
+                <w:sz w:val="17"/>
+              </w:rPr>
+              <w:t>35.0%</w:t>
+            </w:r>
+          </w:p>
+        </w:tc>
+        <w:tc>
+          <w:tcPr>
+            <w:tcW w:type="dxa" w:w="2016"/>
+            <w:shd w:fill="F8FAFC"/>
+            <w:tcMar>
+              <w:top w:w="40" w:type="dxa"/>
+              <w:bottom w:w="40" w:type="dxa"/>
+              <w:left w:w="50" w:type="dxa"/>
+              <w:right w:w="50" w:type="dxa"/>
+            </w:tcMar>
+          </w:tcPr>
+          <w:p>
+            <w:r>
+              <w:rPr>
+                <w:rFonts w:ascii="Calibri" w:hAnsi="Calibri"/>
+                <w:b w:val="0"/>
+                <w:color w:val="1E293B"/>
+                <w:sz w:val="17"/>
+              </w:rPr>
+              <w:t>4.025% of Exposure</w:t>
+            </w:r>
+          </w:p>
+        </w:tc>
+      </w:tr>
+      <w:tr>
+        <w:tc>
+          <w:tcPr>
+            <w:tcW w:type="dxa" w:w="2592"/>
+            <w:shd w:fill="FFFFFF"/>
+            <w:tcMar>
+              <w:top w:w="40" w:type="dxa"/>
+              <w:bottom w:w="40" w:type="dxa"/>
+              <w:left w:w="50" w:type="dxa"/>
+              <w:right w:w="50" w:type="dxa"/>
+            </w:tcMar>
+          </w:tcPr>
+          <w:p>
+            <w:r>
+              <w:rPr>
+                <w:rFonts w:ascii="Calibri" w:hAnsi="Calibri"/>
+                <w:b/>
+                <w:color w:val="003366"/>
+                <w:sz w:val="17"/>
+              </w:rPr>
+              <w:t>Retail: Mid-Risk Housing</w:t>
+            </w:r>
+          </w:p>
+        </w:tc>
+        <w:tc>
+          <w:tcPr>
+            <w:tcW w:type="dxa" w:w="3312"/>
+            <w:shd w:fill="FFFFFF"/>
+            <w:tcMar>
+              <w:top w:w="40" w:type="dxa"/>
+              <w:bottom w:w="40" w:type="dxa"/>
+              <w:left w:w="50" w:type="dxa"/>
+              <w:right w:w="50" w:type="dxa"/>
+            </w:tcMar>
+          </w:tcPr>
+          <w:p>
+            <w:r>
+              <w:rPr>
+                <w:rFonts w:ascii="Calibri" w:hAnsi="Calibri"/>
+                <w:b w:val="0"/>
+                <w:color w:val="1E293B"/>
+                <w:sz w:val="17"/>
+              </w:rPr>
+              <w:t>Housing Loans &gt; ₹75L with LTV &lt;= 75%</w:t>
+            </w:r>
+          </w:p>
+        </w:tc>
+        <w:tc>
+          <w:tcPr>
+            <w:tcW w:type="dxa" w:w="1440"/>
+            <w:shd w:fill="FFFFFF"/>
+            <w:tcMar>
+              <w:top w:w="40" w:type="dxa"/>
+              <w:bottom w:w="40" w:type="dxa"/>
+              <w:left w:w="50" w:type="dxa"/>
+              <w:right w:w="50" w:type="dxa"/>
+            </w:tcMar>
+          </w:tcPr>
+          <w:p>
+            <w:r>
+              <w:rPr>
+                <w:rFonts w:ascii="Calibri" w:hAnsi="Calibri"/>
+                <w:b w:val="0"/>
+                <w:color w:val="1E293B"/>
+                <w:sz w:val="17"/>
+              </w:rPr>
+              <w:t>50.0%</w:t>
+            </w:r>
+          </w:p>
+        </w:tc>
+        <w:tc>
+          <w:tcPr>
+            <w:tcW w:type="dxa" w:w="2016"/>
+            <w:shd w:fill="FFFFFF"/>
+            <w:tcMar>
+              <w:top w:w="40" w:type="dxa"/>
+              <w:bottom w:w="40" w:type="dxa"/>
+              <w:left w:w="50" w:type="dxa"/>
+              <w:right w:w="50" w:type="dxa"/>
+            </w:tcMar>
+          </w:tcPr>
+          <w:p>
+            <w:r>
+              <w:rPr>
+                <w:rFonts w:ascii="Calibri" w:hAnsi="Calibri"/>
+                <w:b w:val="0"/>
+                <w:color w:val="1E293B"/>
+                <w:sz w:val="17"/>
+              </w:rPr>
+              <w:t>5.750% of Exposure</w:t>
+            </w:r>
+          </w:p>
+        </w:tc>
+      </w:tr>
+      <w:tr>
+        <w:tc>
+          <w:tcPr>
+            <w:tcW w:type="dxa" w:w="2592"/>
+            <w:shd w:fill="F8FAFC"/>
+            <w:tcMar>
+              <w:top w:w="40" w:type="dxa"/>
+              <w:bottom w:w="40" w:type="dxa"/>
+              <w:left w:w="50" w:type="dxa"/>
+              <w:right w:w="50" w:type="dxa"/>
+            </w:tcMar>
+          </w:tcPr>
+          <w:p>
+            <w:r>
+              <w:rPr>
+                <w:rFonts w:ascii="Calibri" w:hAnsi="Calibri"/>
+                <w:b/>
+                <w:color w:val="003366"/>
+                <w:sz w:val="17"/>
+              </w:rPr>
+              <w:t>Retail: Consumer / Personal</w:t>
+            </w:r>
+          </w:p>
+        </w:tc>
+        <w:tc>
+          <w:tcPr>
+            <w:tcW w:type="dxa" w:w="3312"/>
+            <w:shd w:fill="F8FAFC"/>
+            <w:tcMar>
+              <w:top w:w="40" w:type="dxa"/>
+              <w:bottom w:w="40" w:type="dxa"/>
+              <w:left w:w="50" w:type="dxa"/>
+              <w:right w:w="50" w:type="dxa"/>
+            </w:tcMar>
+          </w:tcPr>
+          <w:p>
+            <w:r>
+              <w:rPr>
+                <w:rFonts w:ascii="Calibri" w:hAnsi="Calibri"/>
+                <w:b w:val="0"/>
+                <w:color w:val="1E293B"/>
+                <w:sz w:val="17"/>
+              </w:rPr>
+              <w:t>Unsecured Personal Loans, Consumer Credit Cards</w:t>
+            </w:r>
+          </w:p>
+        </w:tc>
+        <w:tc>
+          <w:tcPr>
+            <w:tcW w:type="dxa" w:w="1440"/>
+            <w:shd w:fill="F8FAFC"/>
+            <w:tcMar>
+              <w:top w:w="40" w:type="dxa"/>
+              <w:bottom w:w="40" w:type="dxa"/>
+              <w:left w:w="50" w:type="dxa"/>
+              <w:right w:w="50" w:type="dxa"/>
+            </w:tcMar>
+          </w:tcPr>
+          <w:p>
+            <w:r>
+              <w:rPr>
+                <w:rFonts w:ascii="Calibri" w:hAnsi="Calibri"/>
+                <w:b w:val="0"/>
+                <w:color w:val="1E293B"/>
+                <w:sz w:val="17"/>
+              </w:rPr>
+              <w:t>125.0%</w:t>
+            </w:r>
+          </w:p>
+        </w:tc>
+        <w:tc>
+          <w:tcPr>
+            <w:tcW w:type="dxa" w:w="2016"/>
+            <w:shd w:fill="F8FAFC"/>
+            <w:tcMar>
+              <w:top w:w="40" w:type="dxa"/>
+              <w:bottom w:w="40" w:type="dxa"/>
+              <w:left w:w="50" w:type="dxa"/>
+              <w:right w:w="50" w:type="dxa"/>
+            </w:tcMar>
+          </w:tcPr>
+          <w:p>
+            <w:r>
+              <w:rPr>
+                <w:rFonts w:ascii="Calibri" w:hAnsi="Calibri"/>
+                <w:b w:val="0"/>
+                <w:color w:val="1E293B"/>
+                <w:sz w:val="17"/>
+              </w:rPr>
+              <w:t>14.375% of Exposure</w:t>
+            </w:r>
+          </w:p>
+        </w:tc>
+      </w:tr>
+      <w:tr>
+        <w:tc>
+          <w:tcPr>
+            <w:tcW w:type="dxa" w:w="2592"/>
+            <w:shd w:fill="FFFFFF"/>
+            <w:tcMar>
+              <w:top w:w="40" w:type="dxa"/>
+              <w:bottom w:w="40" w:type="dxa"/>
+              <w:left w:w="50" w:type="dxa"/>
+              <w:right w:w="50" w:type="dxa"/>
+            </w:tcMar>
+          </w:tcPr>
+          <w:p>
+            <w:r>
+              <w:rPr>
+                <w:rFonts w:ascii="Calibri" w:hAnsi="Calibri"/>
+                <w:b/>
+                <w:color w:val="003366"/>
+                <w:sz w:val="17"/>
+              </w:rPr>
+              <w:t>MSME: Investment Grade</w:t>
+            </w:r>
+          </w:p>
+        </w:tc>
+        <w:tc>
+          <w:tcPr>
+            <w:tcW w:type="dxa" w:w="3312"/>
+            <w:shd w:fill="FFFFFF"/>
+            <w:tcMar>
+              <w:top w:w="40" w:type="dxa"/>
+              <w:bottom w:w="40" w:type="dxa"/>
+              <w:left w:w="50" w:type="dxa"/>
+              <w:right w:w="50" w:type="dxa"/>
+            </w:tcMar>
+          </w:tcPr>
+          <w:p>
+            <w:r>
+              <w:rPr>
+                <w:rFonts w:ascii="Calibri" w:hAnsi="Calibri"/>
+                <w:b w:val="0"/>
+                <w:color w:val="1E293B"/>
+                <w:sz w:val="17"/>
+              </w:rPr>
+              <w:t>Rated CBI 1 to CBI 3 (Score &gt; 75), Low PD</w:t>
+            </w:r>
+          </w:p>
+        </w:tc>
+        <w:tc>
+          <w:tcPr>
+            <w:tcW w:type="dxa" w:w="1440"/>
+            <w:shd w:fill="FFFFFF"/>
+            <w:tcMar>
+              <w:top w:w="40" w:type="dxa"/>
+              <w:bottom w:w="40" w:type="dxa"/>
+              <w:left w:w="50" w:type="dxa"/>
+              <w:right w:w="50" w:type="dxa"/>
+            </w:tcMar>
+          </w:tcPr>
+          <w:p>
+            <w:r>
+              <w:rPr>
+                <w:rFonts w:ascii="Calibri" w:hAnsi="Calibri"/>
+                <w:b w:val="0"/>
+                <w:color w:val="1E293B"/>
+                <w:sz w:val="17"/>
+              </w:rPr>
+              <w:t>75.0%</w:t>
+            </w:r>
+          </w:p>
+        </w:tc>
+        <w:tc>
+          <w:tcPr>
+            <w:tcW w:type="dxa" w:w="2016"/>
+            <w:shd w:fill="FFFFFF"/>
+            <w:tcMar>
+              <w:top w:w="40" w:type="dxa"/>
+              <w:bottom w:w="40" w:type="dxa"/>
+              <w:left w:w="50" w:type="dxa"/>
+              <w:right w:w="50" w:type="dxa"/>
+            </w:tcMar>
+          </w:tcPr>
+          <w:p>
+            <w:r>
+              <w:rPr>
+                <w:rFonts w:ascii="Calibri" w:hAnsi="Calibri"/>
+                <w:b w:val="0"/>
+                <w:color w:val="1E293B"/>
+                <w:sz w:val="17"/>
+              </w:rPr>
+              <w:t>8.625% of Exposure</w:t>
+            </w:r>
+          </w:p>
+        </w:tc>
+      </w:tr>
+      <w:tr>
+        <w:tc>
+          <w:tcPr>
+            <w:tcW w:type="dxa" w:w="2592"/>
+            <w:shd w:fill="F8FAFC"/>
+            <w:tcMar>
+              <w:top w:w="40" w:type="dxa"/>
+              <w:bottom w:w="40" w:type="dxa"/>
+              <w:left w:w="50" w:type="dxa"/>
+              <w:right w:w="50" w:type="dxa"/>
+            </w:tcMar>
+          </w:tcPr>
+          <w:p>
+            <w:r>
+              <w:rPr>
+                <w:rFonts w:ascii="Calibri" w:hAnsi="Calibri"/>
+                <w:b/>
+                <w:color w:val="003366"/>
+                <w:sz w:val="17"/>
+              </w:rPr>
+              <w:t>MSME: Standard Grade</w:t>
+            </w:r>
+          </w:p>
+        </w:tc>
+        <w:tc>
+          <w:tcPr>
+            <w:tcW w:type="dxa" w:w="3312"/>
+            <w:shd w:fill="F8FAFC"/>
+            <w:tcMar>
+              <w:top w:w="40" w:type="dxa"/>
+              <w:bottom w:w="40" w:type="dxa"/>
+              <w:left w:w="50" w:type="dxa"/>
+              <w:right w:w="50" w:type="dxa"/>
+            </w:tcMar>
+          </w:tcPr>
+          <w:p>
+            <w:r>
+              <w:rPr>
+                <w:rFonts w:ascii="Calibri" w:hAnsi="Calibri"/>
+                <w:b w:val="0"/>
+                <w:color w:val="1E293B"/>
+                <w:sz w:val="17"/>
+              </w:rPr>
+              <w:t>Rated CBI 4 to CBI 6 (Score 51–75), Moderate PD</w:t>
+            </w:r>
+          </w:p>
+        </w:tc>
+        <w:tc>
+          <w:tcPr>
+            <w:tcW w:type="dxa" w:w="1440"/>
+            <w:shd w:fill="F8FAFC"/>
+            <w:tcMar>
+              <w:top w:w="40" w:type="dxa"/>
+              <w:bottom w:w="40" w:type="dxa"/>
+              <w:left w:w="50" w:type="dxa"/>
+              <w:right w:w="50" w:type="dxa"/>
+            </w:tcMar>
+          </w:tcPr>
+          <w:p>
+            <w:r>
+              <w:rPr>
+                <w:rFonts w:ascii="Calibri" w:hAnsi="Calibri"/>
+                <w:b w:val="0"/>
+                <w:color w:val="1E293B"/>
+                <w:sz w:val="17"/>
+              </w:rPr>
+              <w:t>100.0%</w:t>
+            </w:r>
+          </w:p>
+        </w:tc>
+        <w:tc>
+          <w:tcPr>
+            <w:tcW w:type="dxa" w:w="2016"/>
+            <w:shd w:fill="F8FAFC"/>
+            <w:tcMar>
+              <w:top w:w="40" w:type="dxa"/>
+              <w:bottom w:w="40" w:type="dxa"/>
+              <w:left w:w="50" w:type="dxa"/>
+              <w:right w:w="50" w:type="dxa"/>
+            </w:tcMar>
+          </w:tcPr>
+          <w:p>
+            <w:r>
+              <w:rPr>
+                <w:rFonts w:ascii="Calibri" w:hAnsi="Calibri"/>
+                <w:b w:val="0"/>
+                <w:color w:val="1E293B"/>
+                <w:sz w:val="17"/>
+              </w:rPr>
+              <w:t>11.500% of Exposure</w:t>
+            </w:r>
+          </w:p>
+        </w:tc>
+      </w:tr>
+      <w:tr>
+        <w:tc>
+          <w:tcPr>
+            <w:tcW w:type="dxa" w:w="2592"/>
+            <w:shd w:fill="FFFFFF"/>
+            <w:tcMar>
+              <w:top w:w="40" w:type="dxa"/>
+              <w:bottom w:w="40" w:type="dxa"/>
+              <w:left w:w="50" w:type="dxa"/>
+              <w:right w:w="50" w:type="dxa"/>
+            </w:tcMar>
+          </w:tcPr>
+          <w:p>
+            <w:r>
+              <w:rPr>
+                <w:rFonts w:ascii="Calibri" w:hAnsi="Calibri"/>
+                <w:b/>
+                <w:color w:val="003366"/>
+                <w:sz w:val="17"/>
+              </w:rPr>
+              <w:t>MSME: Sub-Hurdle Grade</w:t>
+            </w:r>
+          </w:p>
+        </w:tc>
+        <w:tc>
+          <w:tcPr>
+            <w:tcW w:type="dxa" w:w="3312"/>
+            <w:shd w:fill="FFFFFF"/>
+            <w:tcMar>
+              <w:top w:w="40" w:type="dxa"/>
+              <w:bottom w:w="40" w:type="dxa"/>
+              <w:left w:w="50" w:type="dxa"/>
+              <w:right w:w="50" w:type="dxa"/>
+            </w:tcMar>
+          </w:tcPr>
+          <w:p>
+            <w:r>
+              <w:rPr>
+                <w:rFonts w:ascii="Calibri" w:hAnsi="Calibri"/>
+                <w:b w:val="0"/>
+                <w:color w:val="1E293B"/>
+                <w:sz w:val="17"/>
+              </w:rPr>
+              <w:t>Rated CBI 7 to CBI 10 (Score &lt;= 50), High Default Risk</w:t>
+            </w:r>
+          </w:p>
+        </w:tc>
+        <w:tc>
+          <w:tcPr>
+            <w:tcW w:type="dxa" w:w="1440"/>
+            <w:shd w:fill="FFFFFF"/>
+            <w:tcMar>
+              <w:top w:w="40" w:type="dxa"/>
+              <w:bottom w:w="40" w:type="dxa"/>
+              <w:left w:w="50" w:type="dxa"/>
+              <w:right w:w="50" w:type="dxa"/>
+            </w:tcMar>
+          </w:tcPr>
+          <w:p>
+            <w:r>
+              <w:rPr>
+                <w:rFonts w:ascii="Calibri" w:hAnsi="Calibri"/>
+                <w:b w:val="0"/>
+                <w:color w:val="1E293B"/>
+                <w:sz w:val="17"/>
+              </w:rPr>
+              <w:t>150.0%</w:t>
+            </w:r>
+          </w:p>
+        </w:tc>
+        <w:tc>
+          <w:tcPr>
+            <w:tcW w:type="dxa" w:w="2016"/>
+            <w:shd w:fill="FFFFFF"/>
+            <w:tcMar>
+              <w:top w:w="40" w:type="dxa"/>
+              <w:bottom w:w="40" w:type="dxa"/>
+              <w:left w:w="50" w:type="dxa"/>
+              <w:right w:w="50" w:type="dxa"/>
+            </w:tcMar>
+          </w:tcPr>
+          <w:p>
+            <w:r>
+              <w:rPr>
+                <w:rFonts w:ascii="Calibri" w:hAnsi="Calibri"/>
+                <w:b w:val="0"/>
+                <w:color w:val="1E293B"/>
+                <w:sz w:val="17"/>
+              </w:rPr>
+              <w:t>17.250% of Exposure</w:t>
+            </w:r>
+          </w:p>
+        </w:tc>
+      </w:tr>
+    </w:tbl>
+    <w:p>
+      <w:pPr>
+        <w:spacing w:after="200"/>
+      </w:pPr>
+    </w:p>
+    <w:p>
+      <w:pPr>
+        <w:spacing w:after="320"/>
+      </w:pPr>
+      <w:r>
+        <w:rPr>
+          <w:rFonts w:ascii="Calibri" w:hAnsi="Calibri"/>
+          <w:b/>
+          <w:color w:val="003366"/>
+          <w:sz w:val="26"/>
+        </w:rPr>
+        <w:t>2.4 Legal &amp; Privacy Norms: DPDP Act 2023 &amp; RBI IT Governance</w:t>
+        <w:br/>
+      </w:r>
+      <w:r>
+        <w:rPr>
+          <w:rFonts w:ascii="Calibri" w:hAnsi="Calibri"/>
+          <w:color w:val="1E293B"/>
+          <w:sz w:val="22"/>
+        </w:rPr>
+        <w:t>In modern digital credit underwriting, financial engineering must strictly co-exist with data privacy jurisprudence and statutory IT risk governance. The deployment of autonomous artificial intelligence systems in commercial banking is governed by two foundational regulatory statutes in India:</w:t>
+        <w:br/>
+        <w:br/>
+        <w:t>1. Digital Personal Data Protection (DPDP) Act 2023 Compliance:</w:t>
+        <w:br/>
+        <w:t>Enacted in August 2023, the DPDP Act establishes statutory duties for commercial banks operating as Data Fiduciaries. The Act mandates:</w:t>
+        <w:br/>
+        <w:t>• Purpose Limitation &amp; Data Minimization: Personal data collected for loan appraisal cannot be repurposed or exposed to external AI model providers without explicit, informed consent.</w:t>
+        <w:br/>
+        <w:t>• Personally Identifiable Information (PII) Protection: Real borrower names, Aadhaar numbers, Permanent Account Numbers (PAN), and mobile contact details must be cryptographically protected.</w:t>
+        <w:br/>
+        <w:t>• Architectural Implementation in ILAS: The platform incorporates a dedicated Customer Agent at the perimeter of the LangGraph state machine. The agent applies an irreversible deterministic tokenization algorithm: Masked_ID = 'APPLICANT_' + SHA256(Real Name || Salt)[:4]. All downstream agents (financial analysis, ML risk, policy RAG, and compliance) execute solely on masked identifiers (APPLICANT_4427), ensuring zero unencrypted PII leakage to external vector databases or model endpoints.</w:t>
+        <w:br/>
+        <w:br/>
+        <w:t>2. RBI Master Direction on IT Governance, Risk &amp; Assurance (2023):</w:t>
+        <w:br/>
+        <w:t>Issued in November 2023 (RBI/2023-24/107 DoS.CO.CSITE.SEC.No.7/31.01.015/2023-24), this directive sets out strict controls for algorithmic systems and automated credit decisioning:</w:t>
+        <w:br/>
+        <w:t>• Model Risk Management (MRM): Automated credit scoring models must undergo rigorous backtesting, boundary validation, and sensitivity benchmarking.</w:t>
+        <w:br/>
+        <w:t>• Prohibition of Unconstrained Auto-Disbursement: Commercial banks must enforce explicit Human-in-the-Loop (HITL) governance gates. Fully automated credit sanctioning without branch credit manager oversight is strictly prohibited.</w:t>
+        <w:br/>
+        <w:t>• Tamper-Proof Audit Logging: Every parameter, credit score, ratio computation, and discretionary manager override must be immutably recorded in a centralized relational repository for inspection by internal bank vigilance and statutory RBI audit teams.</w:t>
+      </w:r>
+    </w:p>
+    <w:p>
+      <w:pPr>
+        <w:spacing w:after="320"/>
+      </w:pPr>
+      <w:r>
+        <w:rPr>
+          <w:rFonts w:ascii="Calibri" w:hAnsi="Calibri"/>
+          <w:b/>
+          <w:color w:val="003366"/>
+          <w:sz w:val="26"/>
+        </w:rPr>
+        <w:t>2.5 Survey of Agentic AI, Multi-Agent State Machines &amp; Hybrid RAG in Banking</w:t>
+        <w:br/>
+      </w:r>
+      <w:r>
+        <w:rPr>
+          <w:rFonts w:ascii="Calibri" w:hAnsi="Calibri"/>
+          <w:color w:val="1E293B"/>
+          <w:sz w:val="22"/>
+        </w:rPr>
+        <w:t>Recent advancements in Large Language Models (LLMs) and agentic workflows have created unprecedented opportunities for financial technology. However, applying generative artificial intelligence to quantitative commercial banking requires addressing critical architectural limitations.</w:t>
+        <w:br/>
+        <w:br/>
+        <w:t>1. The Fallacy of Monolithic, Unconstrained LLMs in Finance:</w:t>
+        <w:br/>
+        <w:t>Early experiments with generative AI in finance utilized monolithic, single-prompt LLMs (e.g., zero-shot GPT-4 or Claude). These architectures suffered from fatal vulnerabilities in institutional banking:</w:t>
+        <w:br/>
+        <w:t>• Mathematical Hallucinations: LLMs perform auto-regressive token probability estimation rather than exact arithmetic, leading to hallucinated debt ratios, incorrect interest compounding, and invalid LTV calculations.</w:t>
+        <w:br/>
+        <w:t>• Token Cost Explosion: Ingesting multi-page balance sheets and hundred-page regulatory circulars into single LLM context windows incurs excessive latency and prohibitive API operational costs (&gt; $0.10 per loan dossier).</w:t>
+        <w:br/>
+        <w:t>• State Loss &amp; Non-Determinism: Monolithic prompts cannot guarantee strict, reproducible adherence to statutory branch credit policies.</w:t>
+        <w:br/>
+        <w:br/>
+        <w:t>2. Multi-Agent State Machine Architecture (LangGraph):</w:t>
+        <w:br/>
+        <w:t>To overcome these limitations, recent research (Wu et al., 2023; Chase et al., 2024) advocates for deterministic multi-agent state machines. In this architecture, loan appraisal is modeled as a stateful, directed graph G = (V, E, S), where V represents 11 isolated agent nodes, E defines conditional transition edges governed by strict mathematical thresholds (such as the 50-mark Hurdle Rate), and S is a globally typed state object (LoanApplicationState) persisted transactionally in PostgreSQL (PostgresSaver). Crucially, mathematical calculations are delegated entirely to local Python mathematical engines ($0 token consumption), while LLMs are restricted strictly to narrative synthesis and semantic policy retrieval.</w:t>
+        <w:br/>
+        <w:br/>
+        <w:t>3. Graph-Agentic Hybrid RAG (GAHR-MSR) in Policy Retrieval:</w:t>
+        <w:br/>
+        <w:t>Standard naive vector retrieval (RAG) fails in banking because regulatory Master Directions contain dense statutory keywords, circular numbers, and precise numeric thresholds that semantic embeddings alone often miss. State-of-the-art financial information retrieval requires a Hybrid Search Architecture:</w:t>
+        <w:br/>
+        <w:t>• Dense Vector Search: Computes cosine similarity across 3072-dimensional vector embeddings stored in PostgreSQL via pgvector to capture high-level semantic intent.</w:t>
+        <w:br/>
+        <w:t>• Sparse Lexical Search: Computes BM25 full-text keyword matching using PostgreSQL inverted indices (tsvector and tsquery) to match exact circular codes, acronyms (e.g., 'CGTMSE', 'RBLR', 'FOIR'), and loan ceilings.</w:t>
+        <w:br/>
+        <w:t>• Reciprocal Rank Fusion (RRF): Merges dense and sparse result lists into a unified relevance ranking without requiring score normalization: RRF_Score(d) = sum(1 / (60 + rank_m(d))).</w:t>
+        <w:br/>
+        <w:t>• Cross-Encoder Re-Ranking: Passes candidate passages through a deep transformer cross-encoder (ms-marco-MiniLM-L-6-v2) to perform full token-level query-document cross-attention, ensuring only verbatim, legally authoritative policy clauses are cited in the final Credit Appraisal Memorandum.</w:t>
       </w:r>
     </w:p>
     <w:sectPr>

</xml_diff>

<commit_message>
docs: Update Front Matter pagination roadmap to optimal institutional length (~85-90 pages)
</commit_message>
<xml_diff>
--- a/Central_Bank_of_India_ILAS_Internship_Report.docx
+++ b/Central_Bank_of_India_ILAS_Internship_Report.docx
@@ -1134,7 +1134,7 @@
                 <w:color w:val="64748B"/>
                 <w:sz w:val="19"/>
               </w:rPr>
-              <w:t>vi</w:t>
+              <w:t>vii</w:t>
             </w:r>
           </w:p>
         </w:tc>
@@ -1183,7 +1183,7 @@
                 <w:color w:val="64748B"/>
                 <w:sz w:val="19"/>
               </w:rPr>
-              <w:t>viii</w:t>
+              <w:t>ix</w:t>
             </w:r>
           </w:p>
         </w:tc>
@@ -1232,7 +1232,7 @@
                 <w:color w:val="64748B"/>
                 <w:sz w:val="19"/>
               </w:rPr>
-              <w:t>ix</w:t>
+              <w:t>x</w:t>
             </w:r>
           </w:p>
         </w:tc>
@@ -1281,7 +1281,7 @@
                 <w:color w:val="64748B"/>
                 <w:sz w:val="19"/>
               </w:rPr>
-              <w:t>x</w:t>
+              <w:t>xi</w:t>
             </w:r>
           </w:p>
         </w:tc>
@@ -1475,7 +1475,7 @@
                 <w:color w:val="64748B"/>
                 <w:sz w:val="19"/>
               </w:rPr>
-              <w:t>4</w:t>
+              <w:t>2</w:t>
             </w:r>
           </w:p>
         </w:tc>
@@ -1524,7 +1524,7 @@
                 <w:color w:val="64748B"/>
                 <w:sz w:val="19"/>
               </w:rPr>
-              <w:t>7</w:t>
+              <w:t>3</w:t>
             </w:r>
           </w:p>
         </w:tc>
@@ -1573,7 +1573,7 @@
                 <w:color w:val="64748B"/>
                 <w:sz w:val="19"/>
               </w:rPr>
-              <w:t>9</w:t>
+              <w:t>4</w:t>
             </w:r>
           </w:p>
         </w:tc>
@@ -1622,7 +1622,7 @@
                 <w:color w:val="64748B"/>
                 <w:sz w:val="19"/>
               </w:rPr>
-              <w:t>12</w:t>
+              <w:t>5</w:t>
             </w:r>
           </w:p>
         </w:tc>
@@ -1671,7 +1671,7 @@
                 <w:color w:val="64748B"/>
                 <w:sz w:val="19"/>
               </w:rPr>
-              <w:t>14</w:t>
+              <w:t>6</w:t>
             </w:r>
           </w:p>
         </w:tc>
@@ -1767,7 +1767,7 @@
                 <w:color w:val="003366"/>
                 <w:sz w:val="19"/>
               </w:rPr>
-              <w:t>16</w:t>
+              <w:t>7</w:t>
             </w:r>
           </w:p>
         </w:tc>
@@ -1816,7 +1816,7 @@
                 <w:color w:val="64748B"/>
                 <w:sz w:val="19"/>
               </w:rPr>
-              <w:t>16</w:t>
+              <w:t>7</w:t>
             </w:r>
           </w:p>
         </w:tc>
@@ -1865,7 +1865,7 @@
                 <w:color w:val="64748B"/>
                 <w:sz w:val="19"/>
               </w:rPr>
-              <w:t>19</w:t>
+              <w:t>8</w:t>
             </w:r>
           </w:p>
         </w:tc>
@@ -1914,7 +1914,7 @@
                 <w:color w:val="64748B"/>
                 <w:sz w:val="19"/>
               </w:rPr>
-              <w:t>23</w:t>
+              <w:t>10</w:t>
             </w:r>
           </w:p>
         </w:tc>
@@ -1963,7 +1963,7 @@
                 <w:color w:val="64748B"/>
                 <w:sz w:val="19"/>
               </w:rPr>
-              <w:t>27</w:t>
+              <w:t>11</w:t>
             </w:r>
           </w:p>
         </w:tc>
@@ -2012,7 +2012,7 @@
                 <w:color w:val="64748B"/>
                 <w:sz w:val="19"/>
               </w:rPr>
-              <w:t>30</w:t>
+              <w:t>12</w:t>
             </w:r>
           </w:p>
         </w:tc>
@@ -2108,7 +2108,7 @@
                 <w:color w:val="003366"/>
                 <w:sz w:val="19"/>
               </w:rPr>
-              <w:t>35</w:t>
+              <w:t>14</w:t>
             </w:r>
           </w:p>
         </w:tc>
@@ -2157,7 +2157,7 @@
                 <w:color w:val="64748B"/>
                 <w:sz w:val="19"/>
               </w:rPr>
-              <w:t>35</w:t>
+              <w:t>14</w:t>
             </w:r>
           </w:p>
         </w:tc>
@@ -2206,7 +2206,7 @@
                 <w:color w:val="64748B"/>
                 <w:sz w:val="19"/>
               </w:rPr>
-              <w:t>38</w:t>
+              <w:t>15</w:t>
             </w:r>
           </w:p>
         </w:tc>
@@ -2255,7 +2255,7 @@
                 <w:color w:val="64748B"/>
                 <w:sz w:val="19"/>
               </w:rPr>
-              <w:t>42</w:t>
+              <w:t>17</w:t>
             </w:r>
           </w:p>
         </w:tc>
@@ -2304,7 +2304,7 @@
                 <w:color w:val="64748B"/>
                 <w:sz w:val="19"/>
               </w:rPr>
-              <w:t>46</w:t>
+              <w:t>18</w:t>
             </w:r>
           </w:p>
         </w:tc>
@@ -2353,7 +2353,7 @@
                 <w:color w:val="64748B"/>
                 <w:sz w:val="19"/>
               </w:rPr>
-              <w:t>49</w:t>
+              <w:t>19</w:t>
             </w:r>
           </w:p>
         </w:tc>
@@ -2449,7 +2449,7 @@
                 <w:color w:val="003366"/>
                 <w:sz w:val="19"/>
               </w:rPr>
-              <w:t>54</w:t>
+              <w:t>21</w:t>
             </w:r>
           </w:p>
         </w:tc>
@@ -2498,7 +2498,7 @@
                 <w:color w:val="64748B"/>
                 <w:sz w:val="19"/>
               </w:rPr>
-              <w:t>54</w:t>
+              <w:t>21</w:t>
             </w:r>
           </w:p>
         </w:tc>
@@ -2547,7 +2547,7 @@
                 <w:color w:val="64748B"/>
                 <w:sz w:val="19"/>
               </w:rPr>
-              <w:t>58</w:t>
+              <w:t>23</w:t>
             </w:r>
           </w:p>
         </w:tc>
@@ -2596,7 +2596,7 @@
                 <w:color w:val="64748B"/>
                 <w:sz w:val="19"/>
               </w:rPr>
-              <w:t>62</w:t>
+              <w:t>24</w:t>
             </w:r>
           </w:p>
         </w:tc>
@@ -2645,7 +2645,7 @@
                 <w:color w:val="64748B"/>
                 <w:sz w:val="19"/>
               </w:rPr>
-              <w:t>75</w:t>
+              <w:t>27</w:t>
             </w:r>
           </w:p>
         </w:tc>
@@ -2694,7 +2694,7 @@
                 <w:color w:val="64748B"/>
                 <w:sz w:val="19"/>
               </w:rPr>
-              <w:t>81</w:t>
+              <w:t>28</w:t>
             </w:r>
           </w:p>
         </w:tc>
@@ -2790,7 +2790,7 @@
                 <w:color w:val="003366"/>
                 <w:sz w:val="19"/>
               </w:rPr>
-              <w:t>87</w:t>
+              <w:t>30</w:t>
             </w:r>
           </w:p>
         </w:tc>
@@ -2839,7 +2839,7 @@
                 <w:color w:val="64748B"/>
                 <w:sz w:val="19"/>
               </w:rPr>
-              <w:t>87</w:t>
+              <w:t>30</w:t>
             </w:r>
           </w:p>
         </w:tc>
@@ -2888,7 +2888,7 @@
                 <w:color w:val="64748B"/>
                 <w:sz w:val="19"/>
               </w:rPr>
-              <w:t>92</w:t>
+              <w:t>32</w:t>
             </w:r>
           </w:p>
         </w:tc>
@@ -2937,7 +2937,7 @@
                 <w:color w:val="64748B"/>
                 <w:sz w:val="19"/>
               </w:rPr>
-              <w:t>99</w:t>
+              <w:t>34</w:t>
             </w:r>
           </w:p>
         </w:tc>
@@ -2986,7 +2986,7 @@
                 <w:color w:val="64748B"/>
                 <w:sz w:val="19"/>
               </w:rPr>
-              <w:t>105</w:t>
+              <w:t>35</w:t>
             </w:r>
           </w:p>
         </w:tc>
@@ -3035,7 +3035,7 @@
                 <w:color w:val="64748B"/>
                 <w:sz w:val="19"/>
               </w:rPr>
-              <w:t>110</w:t>
+              <w:t>36</w:t>
             </w:r>
           </w:p>
         </w:tc>
@@ -3084,7 +3084,7 @@
                 <w:color w:val="64748B"/>
                 <w:sz w:val="19"/>
               </w:rPr>
-              <w:t>114</w:t>
+              <w:t>37</w:t>
             </w:r>
           </w:p>
         </w:tc>
@@ -3180,7 +3180,7 @@
                 <w:color w:val="003366"/>
                 <w:sz w:val="19"/>
               </w:rPr>
-              <w:t>121</w:t>
+              <w:t>39</w:t>
             </w:r>
           </w:p>
         </w:tc>
@@ -3229,7 +3229,7 @@
                 <w:color w:val="64748B"/>
                 <w:sz w:val="19"/>
               </w:rPr>
-              <w:t>121</w:t>
+              <w:t>39</w:t>
             </w:r>
           </w:p>
         </w:tc>
@@ -3278,7 +3278,7 @@
                 <w:color w:val="64748B"/>
                 <w:sz w:val="19"/>
               </w:rPr>
-              <w:t>126</w:t>
+              <w:t>41</w:t>
             </w:r>
           </w:p>
         </w:tc>
@@ -3327,7 +3327,7 @@
                 <w:color w:val="64748B"/>
                 <w:sz w:val="19"/>
               </w:rPr>
-              <w:t>131</w:t>
+              <w:t>42</w:t>
             </w:r>
           </w:p>
         </w:tc>
@@ -3376,7 +3376,7 @@
                 <w:color w:val="64748B"/>
                 <w:sz w:val="19"/>
               </w:rPr>
-              <w:t>136</w:t>
+              <w:t>43</w:t>
             </w:r>
           </w:p>
         </w:tc>
@@ -3425,7 +3425,7 @@
                 <w:color w:val="64748B"/>
                 <w:sz w:val="19"/>
               </w:rPr>
-              <w:t>141</w:t>
+              <w:t>44</w:t>
             </w:r>
           </w:p>
         </w:tc>
@@ -3474,7 +3474,7 @@
                 <w:color w:val="64748B"/>
                 <w:sz w:val="19"/>
               </w:rPr>
-              <w:t>146</w:t>
+              <w:t>45</w:t>
             </w:r>
           </w:p>
         </w:tc>
@@ -3523,7 +3523,7 @@
                 <w:color w:val="64748B"/>
                 <w:sz w:val="19"/>
               </w:rPr>
-              <w:t>151</w:t>
+              <w:t>46</w:t>
             </w:r>
           </w:p>
         </w:tc>
@@ -3619,7 +3619,7 @@
                 <w:color w:val="003366"/>
                 <w:sz w:val="19"/>
               </w:rPr>
-              <w:t>157</w:t>
+              <w:t>48</w:t>
             </w:r>
           </w:p>
         </w:tc>
@@ -3668,7 +3668,7 @@
                 <w:color w:val="64748B"/>
                 <w:sz w:val="19"/>
               </w:rPr>
-              <w:t>157</w:t>
+              <w:t>48</w:t>
             </w:r>
           </w:p>
         </w:tc>
@@ -3717,7 +3717,7 @@
                 <w:color w:val="64748B"/>
                 <w:sz w:val="19"/>
               </w:rPr>
-              <w:t>162</w:t>
+              <w:t>49</w:t>
             </w:r>
           </w:p>
         </w:tc>
@@ -3766,7 +3766,7 @@
                 <w:color w:val="64748B"/>
                 <w:sz w:val="19"/>
               </w:rPr>
-              <w:t>167</w:t>
+              <w:t>51</w:t>
             </w:r>
           </w:p>
         </w:tc>
@@ -3815,7 +3815,7 @@
                 <w:color w:val="64748B"/>
                 <w:sz w:val="19"/>
               </w:rPr>
-              <w:t>172</w:t>
+              <w:t>52</w:t>
             </w:r>
           </w:p>
         </w:tc>
@@ -3864,7 +3864,7 @@
                 <w:color w:val="64748B"/>
                 <w:sz w:val="19"/>
               </w:rPr>
-              <w:t>177</w:t>
+              <w:t>54</w:t>
             </w:r>
           </w:p>
         </w:tc>
@@ -3960,7 +3960,7 @@
                 <w:color w:val="003366"/>
                 <w:sz w:val="19"/>
               </w:rPr>
-              <w:t>183</w:t>
+              <w:t>56</w:t>
             </w:r>
           </w:p>
         </w:tc>
@@ -4009,7 +4009,7 @@
                 <w:color w:val="64748B"/>
                 <w:sz w:val="19"/>
               </w:rPr>
-              <w:t>183</w:t>
+              <w:t>56</w:t>
             </w:r>
           </w:p>
         </w:tc>
@@ -4058,7 +4058,7 @@
                 <w:color w:val="64748B"/>
                 <w:sz w:val="19"/>
               </w:rPr>
-              <w:t>188</w:t>
+              <w:t>58</w:t>
             </w:r>
           </w:p>
         </w:tc>
@@ -4107,7 +4107,7 @@
                 <w:color w:val="64748B"/>
                 <w:sz w:val="19"/>
               </w:rPr>
-              <w:t>193</w:t>
+              <w:t>59</w:t>
             </w:r>
           </w:p>
         </w:tc>
@@ -4156,7 +4156,7 @@
                 <w:color w:val="64748B"/>
                 <w:sz w:val="19"/>
               </w:rPr>
-              <w:t>198</w:t>
+              <w:t>60</w:t>
             </w:r>
           </w:p>
         </w:tc>
@@ -4252,7 +4252,7 @@
                 <w:color w:val="003366"/>
                 <w:sz w:val="19"/>
               </w:rPr>
-              <w:t>203</w:t>
+              <w:t>62</w:t>
             </w:r>
           </w:p>
         </w:tc>
@@ -4301,7 +4301,7 @@
                 <w:color w:val="64748B"/>
                 <w:sz w:val="19"/>
               </w:rPr>
-              <w:t>203</w:t>
+              <w:t>62</w:t>
             </w:r>
           </w:p>
         </w:tc>
@@ -4350,7 +4350,7 @@
                 <w:color w:val="64748B"/>
                 <w:sz w:val="19"/>
               </w:rPr>
-              <w:t>208</w:t>
+              <w:t>64</w:t>
             </w:r>
           </w:p>
         </w:tc>
@@ -4399,7 +4399,7 @@
                 <w:color w:val="64748B"/>
                 <w:sz w:val="19"/>
               </w:rPr>
-              <w:t>213</w:t>
+              <w:t>65</w:t>
             </w:r>
           </w:p>
         </w:tc>
@@ -4448,7 +4448,7 @@
                 <w:color w:val="64748B"/>
                 <w:sz w:val="19"/>
               </w:rPr>
-              <w:t>220</w:t>
+              <w:t>66</w:t>
             </w:r>
           </w:p>
         </w:tc>
@@ -4497,7 +4497,7 @@
                 <w:color w:val="64748B"/>
                 <w:sz w:val="19"/>
               </w:rPr>
-              <w:t>227</w:t>
+              <w:t>67</w:t>
             </w:r>
           </w:p>
         </w:tc>
@@ -4593,7 +4593,7 @@
                 <w:color w:val="003366"/>
                 <w:sz w:val="19"/>
               </w:rPr>
-              <w:t>232</w:t>
+              <w:t>69</w:t>
             </w:r>
           </w:p>
         </w:tc>
@@ -4642,7 +4642,7 @@
                 <w:color w:val="64748B"/>
                 <w:sz w:val="19"/>
               </w:rPr>
-              <w:t>232</w:t>
+              <w:t>69</w:t>
             </w:r>
           </w:p>
         </w:tc>
@@ -4691,7 +4691,7 @@
                 <w:color w:val="64748B"/>
                 <w:sz w:val="19"/>
               </w:rPr>
-              <w:t>237</w:t>
+              <w:t>71</w:t>
             </w:r>
           </w:p>
         </w:tc>
@@ -4740,7 +4740,7 @@
                 <w:color w:val="64748B"/>
                 <w:sz w:val="19"/>
               </w:rPr>
-              <w:t>242</w:t>
+              <w:t>72</w:t>
             </w:r>
           </w:p>
         </w:tc>
@@ -4789,7 +4789,7 @@
                 <w:color w:val="64748B"/>
                 <w:sz w:val="19"/>
               </w:rPr>
-              <w:t>251</w:t>
+              <w:t>75</w:t>
             </w:r>
           </w:p>
         </w:tc>
@@ -4885,7 +4885,7 @@
                 <w:color w:val="003366"/>
                 <w:sz w:val="19"/>
               </w:rPr>
-              <w:t>256</w:t>
+              <w:t>77</w:t>
             </w:r>
           </w:p>
         </w:tc>
@@ -4934,7 +4934,7 @@
                 <w:color w:val="64748B"/>
                 <w:sz w:val="19"/>
               </w:rPr>
-              <w:t>256</w:t>
+              <w:t>77</w:t>
             </w:r>
           </w:p>
         </w:tc>
@@ -4983,7 +4983,7 @@
                 <w:color w:val="64748B"/>
                 <w:sz w:val="19"/>
               </w:rPr>
-              <w:t>260</w:t>
+              <w:t>78</w:t>
             </w:r>
           </w:p>
         </w:tc>
@@ -5032,7 +5032,7 @@
                 <w:color w:val="64748B"/>
                 <w:sz w:val="19"/>
               </w:rPr>
-              <w:t>264</w:t>
+              <w:t>80</w:t>
             </w:r>
           </w:p>
         </w:tc>
@@ -5081,7 +5081,7 @@
                 <w:color w:val="64748B"/>
                 <w:sz w:val="19"/>
               </w:rPr>
-              <w:t>268</w:t>
+              <w:t>81</w:t>
             </w:r>
           </w:p>
         </w:tc>
@@ -5177,7 +5177,7 @@
                 <w:color w:val="003366"/>
                 <w:sz w:val="19"/>
               </w:rPr>
-              <w:t>273</w:t>
+              <w:t>83</w:t>
             </w:r>
           </w:p>
         </w:tc>
@@ -5226,7 +5226,7 @@
                 <w:color w:val="64748B"/>
                 <w:sz w:val="19"/>
               </w:rPr>
-              <w:t>273</w:t>
+              <w:t>83</w:t>
             </w:r>
           </w:p>
         </w:tc>
@@ -5275,7 +5275,7 @@
                 <w:color w:val="64748B"/>
                 <w:sz w:val="19"/>
               </w:rPr>
-              <w:t>277</w:t>
+              <w:t>84</w:t>
             </w:r>
           </w:p>
         </w:tc>
@@ -5324,7 +5324,7 @@
                 <w:color w:val="64748B"/>
                 <w:sz w:val="19"/>
               </w:rPr>
-              <w:t>281</w:t>
+              <w:t>85</w:t>
             </w:r>
           </w:p>
         </w:tc>
@@ -5373,7 +5373,7 @@
                 <w:color w:val="64748B"/>
                 <w:sz w:val="19"/>
               </w:rPr>
-              <w:t>284</w:t>
+              <w:t>86</w:t>
             </w:r>
           </w:p>
         </w:tc>
@@ -5469,7 +5469,7 @@
                 <w:color w:val="003366"/>
                 <w:sz w:val="19"/>
               </w:rPr>
-              <w:t>289</w:t>
+              <w:t>88</w:t>
             </w:r>
           </w:p>
         </w:tc>
@@ -5696,7 +5696,7 @@
                 <w:color w:val="1E293B"/>
                 <w:sz w:val="18"/>
               </w:rPr>
-              <w:t>8</w:t>
+              <w:t>3</w:t>
             </w:r>
           </w:p>
         </w:tc>
@@ -5796,7 +5796,7 @@
                 <w:color w:val="1E293B"/>
                 <w:sz w:val="18"/>
               </w:rPr>
-              <w:t>50</w:t>
+              <w:t>19</w:t>
             </w:r>
           </w:p>
         </w:tc>
@@ -5896,7 +5896,7 @@
                 <w:color w:val="1E293B"/>
                 <w:sz w:val="18"/>
               </w:rPr>
-              <w:t>52</w:t>
+              <w:t>20</w:t>
             </w:r>
           </w:p>
         </w:tc>
@@ -5996,7 +5996,7 @@
                 <w:color w:val="1E293B"/>
                 <w:sz w:val="18"/>
               </w:rPr>
-              <w:t>55</w:t>
+              <w:t>22</w:t>
             </w:r>
           </w:p>
         </w:tc>
@@ -6096,7 +6096,7 @@
                 <w:color w:val="1E293B"/>
                 <w:sz w:val="18"/>
               </w:rPr>
-              <w:t>59</w:t>
+              <w:t>23</w:t>
             </w:r>
           </w:p>
         </w:tc>
@@ -6196,7 +6196,7 @@
                 <w:color w:val="1E293B"/>
                 <w:sz w:val="18"/>
               </w:rPr>
-              <w:t>82</w:t>
+              <w:t>29</w:t>
             </w:r>
           </w:p>
         </w:tc>
@@ -6296,7 +6296,7 @@
                 <w:color w:val="1E293B"/>
                 <w:sz w:val="18"/>
               </w:rPr>
-              <w:t>89</w:t>
+              <w:t>31</w:t>
             </w:r>
           </w:p>
         </w:tc>
@@ -6396,7 +6396,7 @@
                 <w:color w:val="1E293B"/>
                 <w:sz w:val="18"/>
               </w:rPr>
-              <w:t>94</w:t>
+              <w:t>33</w:t>
             </w:r>
           </w:p>
         </w:tc>
@@ -6496,7 +6496,7 @@
                 <w:color w:val="1E293B"/>
                 <w:sz w:val="18"/>
               </w:rPr>
-              <w:t>108</w:t>
+              <w:t>36</w:t>
             </w:r>
           </w:p>
         </w:tc>
@@ -6596,7 +6596,7 @@
                 <w:color w:val="1E293B"/>
                 <w:sz w:val="18"/>
               </w:rPr>
-              <w:t>123</w:t>
+              <w:t>40</w:t>
             </w:r>
           </w:p>
         </w:tc>
@@ -6696,7 +6696,7 @@
                 <w:color w:val="1E293B"/>
                 <w:sz w:val="18"/>
               </w:rPr>
-              <w:t>133</w:t>
+              <w:t>42</w:t>
             </w:r>
           </w:p>
         </w:tc>
@@ -6796,7 +6796,7 @@
                 <w:color w:val="1E293B"/>
                 <w:sz w:val="18"/>
               </w:rPr>
-              <w:t>138</w:t>
+              <w:t>44</w:t>
             </w:r>
           </w:p>
         </w:tc>
@@ -6896,7 +6896,7 @@
                 <w:color w:val="1E293B"/>
                 <w:sz w:val="18"/>
               </w:rPr>
-              <w:t>143</w:t>
+              <w:t>45</w:t>
             </w:r>
           </w:p>
         </w:tc>
@@ -6996,7 +6996,7 @@
                 <w:color w:val="1E293B"/>
                 <w:sz w:val="18"/>
               </w:rPr>
-              <w:t>153</w:t>
+              <w:t>47</w:t>
             </w:r>
           </w:p>
         </w:tc>
@@ -7096,7 +7096,7 @@
                 <w:color w:val="1E293B"/>
                 <w:sz w:val="18"/>
               </w:rPr>
-              <w:t>164</w:t>
+              <w:t>50</w:t>
             </w:r>
           </w:p>
         </w:tc>
@@ -7196,7 +7196,7 @@
                 <w:color w:val="1E293B"/>
                 <w:sz w:val="18"/>
               </w:rPr>
-              <w:t>173</w:t>
+              <w:t>53</w:t>
             </w:r>
           </w:p>
         </w:tc>
@@ -7296,7 +7296,7 @@
                 <w:color w:val="1E293B"/>
                 <w:sz w:val="18"/>
               </w:rPr>
-              <w:t>178</w:t>
+              <w:t>54</w:t>
             </w:r>
           </w:p>
         </w:tc>
@@ -7396,7 +7396,7 @@
                 <w:color w:val="1E293B"/>
                 <w:sz w:val="18"/>
               </w:rPr>
-              <w:t>180</w:t>
+              <w:t>55</w:t>
             </w:r>
           </w:p>
         </w:tc>
@@ -7496,7 +7496,7 @@
                 <w:color w:val="1E293B"/>
                 <w:sz w:val="18"/>
               </w:rPr>
-              <w:t>185</w:t>
+              <w:t>57</w:t>
             </w:r>
           </w:p>
         </w:tc>
@@ -7596,7 +7596,7 @@
                 <w:color w:val="1E293B"/>
                 <w:sz w:val="18"/>
               </w:rPr>
-              <w:t>205</w:t>
+              <w:t>63</w:t>
             </w:r>
           </w:p>
         </w:tc>
@@ -7696,7 +7696,7 @@
                 <w:color w:val="1E293B"/>
                 <w:sz w:val="18"/>
               </w:rPr>
-              <w:t>215</w:t>
+              <w:t>65</w:t>
             </w:r>
           </w:p>
         </w:tc>
@@ -7796,7 +7796,7 @@
                 <w:color w:val="1E293B"/>
                 <w:sz w:val="18"/>
               </w:rPr>
-              <w:t>222</w:t>
+              <w:t>67</w:t>
             </w:r>
           </w:p>
         </w:tc>
@@ -7896,7 +7896,7 @@
                 <w:color w:val="1E293B"/>
                 <w:sz w:val="18"/>
               </w:rPr>
-              <w:t>253</w:t>
+              <w:t>75</w:t>
             </w:r>
           </w:p>
         </w:tc>
@@ -8123,7 +8123,7 @@
                 <w:color w:val="1E293B"/>
                 <w:sz w:val="18"/>
               </w:rPr>
-              <w:t>7</w:t>
+              <w:t>3</w:t>
             </w:r>
           </w:p>
         </w:tc>
@@ -8223,7 +8223,7 @@
                 <w:color w:val="1E293B"/>
                 <w:sz w:val="18"/>
               </w:rPr>
-              <w:t>21</w:t>
+              <w:t>9</w:t>
             </w:r>
           </w:p>
         </w:tc>
@@ -8323,7 +8323,7 @@
                 <w:color w:val="1E293B"/>
                 <w:sz w:val="18"/>
               </w:rPr>
-              <w:t>25</w:t>
+              <w:t>11</w:t>
             </w:r>
           </w:p>
         </w:tc>
@@ -8423,7 +8423,7 @@
                 <w:color w:val="1E293B"/>
                 <w:sz w:val="18"/>
               </w:rPr>
-              <w:t>39</w:t>
+              <w:t>16</w:t>
             </w:r>
           </w:p>
         </w:tc>
@@ -8523,7 +8523,7 @@
                 <w:color w:val="1E293B"/>
                 <w:sz w:val="18"/>
               </w:rPr>
-              <w:t>43</w:t>
+              <w:t>17</w:t>
             </w:r>
           </w:p>
         </w:tc>
@@ -8623,7 +8623,7 @@
                 <w:color w:val="1E293B"/>
                 <w:sz w:val="18"/>
               </w:rPr>
-              <w:t>63</w:t>
+              <w:t>25</w:t>
             </w:r>
           </w:p>
         </w:tc>
@@ -8723,7 +8723,7 @@
                 <w:color w:val="1E293B"/>
                 <w:sz w:val="18"/>
               </w:rPr>
-              <w:t>77</w:t>
+              <w:t>28</w:t>
             </w:r>
           </w:p>
         </w:tc>
@@ -8823,7 +8823,7 @@
                 <w:color w:val="1E293B"/>
                 <w:sz w:val="18"/>
               </w:rPr>
-              <w:t>95</w:t>
+              <w:t>33</w:t>
             </w:r>
           </w:p>
         </w:tc>
@@ -8923,7 +8923,7 @@
                 <w:color w:val="1E293B"/>
                 <w:sz w:val="18"/>
               </w:rPr>
-              <w:t>101</w:t>
+              <w:t>34</w:t>
             </w:r>
           </w:p>
         </w:tc>
@@ -9023,7 +9023,7 @@
                 <w:color w:val="1E293B"/>
                 <w:sz w:val="18"/>
               </w:rPr>
-              <w:t>106</w:t>
+              <w:t>35</w:t>
             </w:r>
           </w:p>
         </w:tc>
@@ -9123,7 +9123,7 @@
                 <w:color w:val="1E293B"/>
                 <w:sz w:val="18"/>
               </w:rPr>
-              <w:t>116</w:t>
+              <w:t>37</w:t>
             </w:r>
           </w:p>
         </w:tc>
@@ -9223,7 +9223,7 @@
                 <w:color w:val="1E293B"/>
                 <w:sz w:val="18"/>
               </w:rPr>
-              <w:t>128</w:t>
+              <w:t>41</w:t>
             </w:r>
           </w:p>
         </w:tc>
@@ -9273,7 +9273,7 @@
                 <w:color w:val="1E293B"/>
                 <w:sz w:val="18"/>
               </w:rPr>
-              <w:t>Emerging Market Altman Z''-Score Variables &amp; Parameter Coefficients</w:t>
+              <w:t>Emerening Market Altman Z''-Score Variables &amp; Parameter Coefficients</w:t>
             </w:r>
           </w:p>
         </w:tc>
@@ -9323,7 +9323,7 @@
                 <w:color w:val="1E293B"/>
                 <w:sz w:val="18"/>
               </w:rPr>
-              <w:t>137</w:t>
+              <w:t>43</w:t>
             </w:r>
           </w:p>
         </w:tc>
@@ -9423,7 +9423,7 @@
                 <w:color w:val="1E293B"/>
                 <w:sz w:val="18"/>
               </w:rPr>
-              <w:t>142</w:t>
+              <w:t>44</w:t>
             </w:r>
           </w:p>
         </w:tc>
@@ -9523,7 +9523,7 @@
                 <w:color w:val="1E293B"/>
                 <w:sz w:val="18"/>
               </w:rPr>
-              <w:t>148</w:t>
+              <w:t>46</w:t>
             </w:r>
           </w:p>
         </w:tc>
@@ -9623,7 +9623,7 @@
                 <w:color w:val="1E293B"/>
                 <w:sz w:val="18"/>
               </w:rPr>
-              <w:t>163</w:t>
+              <w:t>50</w:t>
             </w:r>
           </w:p>
         </w:tc>
@@ -9723,7 +9723,7 @@
                 <w:color w:val="1E293B"/>
                 <w:sz w:val="18"/>
               </w:rPr>
-              <w:t>174</w:t>
+              <w:t>53</w:t>
             </w:r>
           </w:p>
         </w:tc>
@@ -9823,7 +9823,7 @@
                 <w:color w:val="1E293B"/>
                 <w:sz w:val="18"/>
               </w:rPr>
-              <w:t>194</w:t>
+              <w:t>59</w:t>
             </w:r>
           </w:p>
         </w:tc>
@@ -9923,7 +9923,7 @@
                 <w:color w:val="1E293B"/>
                 <w:sz w:val="18"/>
               </w:rPr>
-              <w:t>239</w:t>
+              <w:t>71</w:t>
             </w:r>
           </w:p>
         </w:tc>
@@ -10023,7 +10023,7 @@
                 <w:color w:val="1E293B"/>
                 <w:sz w:val="18"/>
               </w:rPr>
-              <w:t>244</w:t>
+              <w:t>73</w:t>
             </w:r>
           </w:p>
         </w:tc>
@@ -10123,7 +10123,7 @@
                 <w:color w:val="1E293B"/>
                 <w:sz w:val="18"/>
               </w:rPr>
-              <w:t>254</w:t>
+              <w:t>76</w:t>
             </w:r>
           </w:p>
         </w:tc>

</xml_diff>